<commit_message>
Claude Code first run
</commit_message>
<xml_diff>
--- a/Project-Details.docx
+++ b/Project-Details.docx
@@ -151,7 +151,23 @@
           <w:kern w:val="0"/>
           <w14:ligatures w14:val="none"/>
         </w:rPr>
-        <w:t xml:space="preserve"> the highest </w:t>
+        <w:t xml:space="preserve"> the</w:t>
+      </w:r>
+      <w:r>
+        <w:rPr>
+          <w:rFonts w:ascii="Times New Roman" w:eastAsia="Times New Roman" w:hAnsi="Times New Roman" w:cs="Times New Roman"/>
+          <w:kern w:val="0"/>
+          <w14:ligatures w14:val="none"/>
+        </w:rPr>
+        <w:t xml:space="preserve"> the swarm with</w:t>
+      </w:r>
+      <w:r>
+        <w:rPr>
+          <w:rFonts w:ascii="Times New Roman" w:eastAsia="Times New Roman" w:hAnsi="Times New Roman" w:cs="Times New Roman"/>
+          <w:kern w:val="0"/>
+          <w14:ligatures w14:val="none"/>
+        </w:rPr>
+        <w:t xml:space="preserve"> highest </w:t>
       </w:r>
       <w:r>
         <w:rPr>
@@ -167,23 +183,55 @@
           <w:kern w:val="0"/>
           <w14:ligatures w14:val="none"/>
         </w:rPr>
-        <w:t>, best</w:t>
-      </w:r>
-      <w:r>
-        <w:rPr>
-          <w:rFonts w:ascii="Times New Roman" w:eastAsia="Times New Roman" w:hAnsi="Times New Roman" w:cs="Times New Roman"/>
-          <w:kern w:val="0"/>
-          <w14:ligatures w14:val="none"/>
-        </w:rPr>
-        <w:t xml:space="preserve"> condition</w:t>
-      </w:r>
-      <w:r>
-        <w:rPr>
-          <w:rFonts w:ascii="Times New Roman" w:eastAsia="Times New Roman" w:hAnsi="Times New Roman" w:cs="Times New Roman"/>
-          <w:kern w:val="0"/>
-          <w14:ligatures w14:val="none"/>
-        </w:rPr>
-        <w:t xml:space="preserve"> and cheapest policies</w:t>
+        <w:t>,</w:t>
+      </w:r>
+      <w:r>
+        <w:rPr>
+          <w:rFonts w:ascii="Times New Roman" w:eastAsia="Times New Roman" w:hAnsi="Times New Roman" w:cs="Times New Roman"/>
+          <w:kern w:val="0"/>
+          <w14:ligatures w14:val="none"/>
+        </w:rPr>
+        <w:t xml:space="preserve"> </w:t>
+      </w:r>
+      <w:r>
+        <w:rPr>
+          <w:rFonts w:ascii="Times New Roman" w:eastAsia="Times New Roman" w:hAnsi="Times New Roman" w:cs="Times New Roman"/>
+          <w:kern w:val="0"/>
+          <w14:ligatures w14:val="none"/>
+        </w:rPr>
+        <w:t xml:space="preserve">best health </w:t>
+      </w:r>
+      <w:r>
+        <w:rPr>
+          <w:rFonts w:ascii="Times New Roman" w:eastAsia="Times New Roman" w:hAnsi="Times New Roman" w:cs="Times New Roman"/>
+          <w:kern w:val="0"/>
+          <w14:ligatures w14:val="none"/>
+        </w:rPr>
+        <w:t>condition</w:t>
+      </w:r>
+      <w:r>
+        <w:rPr>
+          <w:rFonts w:ascii="Times New Roman" w:eastAsia="Times New Roman" w:hAnsi="Times New Roman" w:cs="Times New Roman"/>
+          <w:kern w:val="0"/>
+          <w14:ligatures w14:val="none"/>
+        </w:rPr>
+        <w:t xml:space="preserve"> and</w:t>
+      </w:r>
+      <w:r>
+        <w:rPr>
+          <w:rFonts w:ascii="Times New Roman" w:eastAsia="Times New Roman" w:hAnsi="Times New Roman" w:cs="Times New Roman"/>
+          <w:kern w:val="0"/>
+          <w14:ligatures w14:val="none"/>
+        </w:rPr>
+        <w:t xml:space="preserve"> and using</w:t>
+      </w:r>
+      <w:r>
+        <w:rPr>
+          <w:rFonts w:ascii="Times New Roman" w:eastAsia="Times New Roman" w:hAnsi="Times New Roman" w:cs="Times New Roman"/>
+          <w:kern w:val="0"/>
+          <w14:ligatures w14:val="none"/>
+        </w:rPr>
+        <w:t xml:space="preserve"> cheapest policies</w:t>
       </w:r>
       <w:r>
         <w:rPr>
@@ -1747,7 +1795,7 @@
           <w:kern w:val="0"/>
           <w14:ligatures w14:val="none"/>
         </w:rPr>
-        <w:t xml:space="preserve"> The number of TimeSteps between each </w:t>
+        <w:t xml:space="preserve"> The number of TimeSteps between </w:t>
       </w:r>
       <w:r>
         <w:rPr>
@@ -1763,7 +1811,23 @@
           <w:kern w:val="0"/>
           <w14:ligatures w14:val="none"/>
         </w:rPr>
-        <w:t xml:space="preserve"> drop.</w:t>
+        <w:t xml:space="preserve"> drop</w:t>
+      </w:r>
+      <w:r>
+        <w:rPr>
+          <w:rFonts w:ascii="Times New Roman" w:eastAsia="Times New Roman" w:hAnsi="Times New Roman" w:cs="Times New Roman"/>
+          <w:kern w:val="0"/>
+          <w14:ligatures w14:val="none"/>
+        </w:rPr>
+        <w:t>s</w:t>
+      </w:r>
+      <w:r>
+        <w:rPr>
+          <w:rFonts w:ascii="Times New Roman" w:eastAsia="Times New Roman" w:hAnsi="Times New Roman" w:cs="Times New Roman"/>
+          <w:kern w:val="0"/>
+          <w14:ligatures w14:val="none"/>
+        </w:rPr>
+        <w:t>.</w:t>
       </w:r>
     </w:p>
     <w:p>
@@ -1800,7 +1864,7 @@
           <w:kern w:val="0"/>
           <w14:ligatures w14:val="none"/>
         </w:rPr>
-        <w:t xml:space="preserve"> The exact number of Normal Pellets spawned per drop.</w:t>
+        <w:t xml:space="preserve"> The exact number of Normal Pellets per drop.</w:t>
       </w:r>
     </w:p>
     <w:p>
@@ -1837,7 +1901,23 @@
           <w:kern w:val="0"/>
           <w14:ligatures w14:val="none"/>
         </w:rPr>
-        <w:t xml:space="preserve"> Where the food physically spawns.</w:t>
+        <w:t xml:space="preserve"> Where the food physically </w:t>
+      </w:r>
+      <w:r>
+        <w:rPr>
+          <w:rFonts w:ascii="Times New Roman" w:eastAsia="Times New Roman" w:hAnsi="Times New Roman" w:cs="Times New Roman"/>
+          <w:kern w:val="0"/>
+          <w14:ligatures w14:val="none"/>
+        </w:rPr>
+        <w:t>drops</w:t>
+      </w:r>
+      <w:r>
+        <w:rPr>
+          <w:rFonts w:ascii="Times New Roman" w:eastAsia="Times New Roman" w:hAnsi="Times New Roman" w:cs="Times New Roman"/>
+          <w:kern w:val="0"/>
+          <w14:ligatures w14:val="none"/>
+        </w:rPr>
+        <w:t>.</w:t>
       </w:r>
     </w:p>
     <w:p>
@@ -2037,7 +2117,23 @@
           <w:kern w:val="0"/>
           <w14:ligatures w14:val="none"/>
         </w:rPr>
-        <w:t xml:space="preserve"> The number of TimeSteps between each medicine drop.</w:t>
+        <w:t xml:space="preserve"> The number of TimeSteps between medicine drop</w:t>
+      </w:r>
+      <w:r>
+        <w:rPr>
+          <w:rFonts w:ascii="Times New Roman" w:eastAsia="Times New Roman" w:hAnsi="Times New Roman" w:cs="Times New Roman"/>
+          <w:kern w:val="0"/>
+          <w14:ligatures w14:val="none"/>
+        </w:rPr>
+        <w:t>s</w:t>
+      </w:r>
+      <w:r>
+        <w:rPr>
+          <w:rFonts w:ascii="Times New Roman" w:eastAsia="Times New Roman" w:hAnsi="Times New Roman" w:cs="Times New Roman"/>
+          <w:kern w:val="0"/>
+          <w14:ligatures w14:val="none"/>
+        </w:rPr>
+        <w:t>.</w:t>
       </w:r>
     </w:p>
     <w:p>
@@ -2074,7 +2170,7 @@
           <w:kern w:val="0"/>
           <w14:ligatures w14:val="none"/>
         </w:rPr>
-        <w:t xml:space="preserve"> The exact number of Probiotic Pellets spawned per drop.</w:t>
+        <w:t xml:space="preserve"> The exact number of Probiotic Pellets per drop.</w:t>
       </w:r>
     </w:p>
     <w:p>
@@ -2111,7 +2207,23 @@
           <w:kern w:val="0"/>
           <w14:ligatures w14:val="none"/>
         </w:rPr>
-        <w:t xml:space="preserve"> Where the medicine physically spawns.</w:t>
+        <w:t xml:space="preserve"> Where the medicine physically </w:t>
+      </w:r>
+      <w:r>
+        <w:rPr>
+          <w:rFonts w:ascii="Times New Roman" w:eastAsia="Times New Roman" w:hAnsi="Times New Roman" w:cs="Times New Roman"/>
+          <w:kern w:val="0"/>
+          <w14:ligatures w14:val="none"/>
+        </w:rPr>
+        <w:t>drops</w:t>
+      </w:r>
+      <w:r>
+        <w:rPr>
+          <w:rFonts w:ascii="Times New Roman" w:eastAsia="Times New Roman" w:hAnsi="Times New Roman" w:cs="Times New Roman"/>
+          <w:kern w:val="0"/>
+          <w14:ligatures w14:val="none"/>
+        </w:rPr>
+        <w:t>.</w:t>
       </w:r>
     </w:p>
     <w:p>
@@ -2221,7 +2333,6 @@
           <w:kern w:val="0"/>
           <w14:ligatures w14:val="none"/>
         </w:rPr>
-        <w:lastRenderedPageBreak/>
         <w:t>Total_Probiotic_Cost (Engine Calculated):</w:t>
       </w:r>
       <w:r>
@@ -2275,6 +2386,7 @@
           <w:kern w:val="0"/>
           <w14:ligatures w14:val="none"/>
         </w:rPr>
+        <w:lastRenderedPageBreak/>
         <w:t>3. Oxygen-Pumping Policy Genes</w:t>
       </w:r>
     </w:p>
@@ -2322,7 +2434,23 @@
           <w:kern w:val="0"/>
           <w14:ligatures w14:val="none"/>
         </w:rPr>
-        <w:t xml:space="preserve"> The number of TimeSteps between pump activations.</w:t>
+        <w:t xml:space="preserve"> The number of TimeSteps between pump</w:t>
+      </w:r>
+      <w:r>
+        <w:rPr>
+          <w:rFonts w:ascii="Times New Roman" w:eastAsia="Times New Roman" w:hAnsi="Times New Roman" w:cs="Times New Roman"/>
+          <w:kern w:val="0"/>
+          <w14:ligatures w14:val="none"/>
+        </w:rPr>
+        <w:t>s</w:t>
+      </w:r>
+      <w:r>
+        <w:rPr>
+          <w:rFonts w:ascii="Times New Roman" w:eastAsia="Times New Roman" w:hAnsi="Times New Roman" w:cs="Times New Roman"/>
+          <w:kern w:val="0"/>
+          <w14:ligatures w14:val="none"/>
+        </w:rPr>
+        <w:t>.</w:t>
       </w:r>
     </w:p>
     <w:p>
@@ -2351,7 +2479,7 @@
           <w:kern w:val="0"/>
           <w14:ligatures w14:val="none"/>
         </w:rPr>
-        <w:t xml:space="preserve"> </w:t>
+        <w:t>Oxygen</w:t>
       </w:r>
       <w:r>
         <w:rPr>
@@ -2361,16 +2489,6 @@
           <w:kern w:val="0"/>
           <w14:ligatures w14:val="none"/>
         </w:rPr>
-        <w:t>Oxygen</w:t>
-      </w:r>
-      <w:r>
-        <w:rPr>
-          <w:rFonts w:ascii="Times New Roman" w:eastAsia="Times New Roman" w:hAnsi="Times New Roman" w:cs="Times New Roman"/>
-          <w:b/>
-          <w:bCs/>
-          <w:kern w:val="0"/>
-          <w14:ligatures w14:val="none"/>
-        </w:rPr>
         <w:t>_Duration (Integer: 1 to 4):</w:t>
       </w:r>
       <w:r>
@@ -2379,7 +2497,31 @@
           <w:kern w:val="0"/>
           <w14:ligatures w14:val="none"/>
         </w:rPr>
-        <w:t xml:space="preserve"> How many TimeSteps the pump remains active once turned on.</w:t>
+        <w:t xml:space="preserve"> How many TimeSteps the pump </w:t>
+      </w:r>
+      <w:r>
+        <w:rPr>
+          <w:rFonts w:ascii="Times New Roman" w:eastAsia="Times New Roman" w:hAnsi="Times New Roman" w:cs="Times New Roman"/>
+          <w:kern w:val="0"/>
+          <w14:ligatures w14:val="none"/>
+        </w:rPr>
+        <w:t>stays</w:t>
+      </w:r>
+      <w:r>
+        <w:rPr>
+          <w:rFonts w:ascii="Times New Roman" w:eastAsia="Times New Roman" w:hAnsi="Times New Roman" w:cs="Times New Roman"/>
+          <w:kern w:val="0"/>
+          <w14:ligatures w14:val="none"/>
+        </w:rPr>
+        <w:t xml:space="preserve"> active</w:t>
+      </w:r>
+      <w:r>
+        <w:rPr>
+          <w:rFonts w:ascii="Times New Roman" w:eastAsia="Times New Roman" w:hAnsi="Times New Roman" w:cs="Times New Roman"/>
+          <w:kern w:val="0"/>
+          <w14:ligatures w14:val="none"/>
+        </w:rPr>
+        <w:t>.</w:t>
       </w:r>
     </w:p>
     <w:p>
@@ -2426,7 +2568,7 @@
           <w:kern w:val="0"/>
           <w14:ligatures w14:val="none"/>
         </w:rPr>
-        <w:t xml:space="preserve"> Where the mechanical pumps are physically located.</w:t>
+        <w:t xml:space="preserve"> Where the pumps are located.</w:t>
       </w:r>
     </w:p>
     <w:p>
@@ -2953,7 +3095,7 @@
           <w:kern w:val="0"/>
           <w14:ligatures w14:val="none"/>
         </w:rPr>
-        <w:t xml:space="preserve">C - </w:t>
+        <w:t xml:space="preserve">C </w:t>
       </w:r>
       <w:r>
         <w:rPr>
@@ -2963,15 +3105,115 @@
           <w:kern w:val="0"/>
           <w14:ligatures w14:val="none"/>
         </w:rPr>
-        <w:t>Best Condition:</w:t>
-      </w:r>
-      <w:r>
-        <w:rPr>
-          <w:rFonts w:ascii="Times New Roman" w:eastAsia="Times New Roman" w:hAnsi="Times New Roman" w:cs="Times New Roman"/>
-          <w:kern w:val="0"/>
-          <w14:ligatures w14:val="none"/>
-        </w:rPr>
-        <w:t xml:space="preserve"> The normalized average of Oxygen, HP, Energy, Fullness, and Immunity. (Value: 0.0 to 1.0)</w:t>
+        <w:t>–</w:t>
+      </w:r>
+      <w:r>
+        <w:rPr>
+          <w:rFonts w:ascii="Times New Roman" w:eastAsia="Times New Roman" w:hAnsi="Times New Roman" w:cs="Times New Roman"/>
+          <w:b/>
+          <w:bCs/>
+          <w:kern w:val="0"/>
+          <w14:ligatures w14:val="none"/>
+        </w:rPr>
+        <w:t xml:space="preserve"> </w:t>
+      </w:r>
+      <w:r>
+        <w:rPr>
+          <w:rFonts w:ascii="Times New Roman" w:eastAsia="Times New Roman" w:hAnsi="Times New Roman" w:cs="Times New Roman"/>
+          <w:b/>
+          <w:bCs/>
+          <w:kern w:val="0"/>
+          <w14:ligatures w14:val="none"/>
+        </w:rPr>
+        <w:t>Swarm’s Health:</w:t>
+      </w:r>
+      <w:r>
+        <w:rPr>
+          <w:rFonts w:ascii="Times New Roman" w:eastAsia="Times New Roman" w:hAnsi="Times New Roman" w:cs="Times New Roman"/>
+          <w:kern w:val="0"/>
+          <w14:ligatures w14:val="none"/>
+        </w:rPr>
+        <w:t xml:space="preserve"> The normalized average</w:t>
+      </w:r>
+      <w:r>
+        <w:rPr>
+          <w:rFonts w:ascii="Times New Roman" w:eastAsia="Times New Roman" w:hAnsi="Times New Roman" w:cs="Times New Roman"/>
+          <w:kern w:val="0"/>
+          <w14:ligatures w14:val="none"/>
+        </w:rPr>
+        <w:t xml:space="preserve"> </w:t>
+      </w:r>
+      <w:r>
+        <w:rPr>
+          <w:rFonts w:ascii="Times New Roman" w:eastAsia="Times New Roman" w:hAnsi="Times New Roman" w:cs="Times New Roman"/>
+          <w:kern w:val="0"/>
+          <w14:ligatures w14:val="none"/>
+        </w:rPr>
+        <w:t>(</w:t>
+      </w:r>
+      <w:r>
+        <w:rPr>
+          <w:rFonts w:ascii="Times New Roman" w:eastAsia="Times New Roman" w:hAnsi="Times New Roman" w:cs="Times New Roman"/>
+          <w:kern w:val="0"/>
+          <w14:ligatures w14:val="none"/>
+        </w:rPr>
+        <w:t xml:space="preserve">from </w:t>
+      </w:r>
+      <w:r>
+        <w:rPr>
+          <w:rFonts w:ascii="Times New Roman" w:eastAsia="Times New Roman" w:hAnsi="Times New Roman" w:cs="Times New Roman"/>
+          <w:kern w:val="0"/>
+          <w14:ligatures w14:val="none"/>
+        </w:rPr>
+        <w:t>0.0 to 1.0)</w:t>
+      </w:r>
+      <w:r>
+        <w:rPr>
+          <w:rFonts w:ascii="Times New Roman" w:eastAsia="Times New Roman" w:hAnsi="Times New Roman" w:cs="Times New Roman"/>
+          <w:kern w:val="0"/>
+          <w14:ligatures w14:val="none"/>
+        </w:rPr>
+        <w:t xml:space="preserve"> </w:t>
+      </w:r>
+      <w:r>
+        <w:rPr>
+          <w:rFonts w:ascii="Times New Roman" w:eastAsia="Times New Roman" w:hAnsi="Times New Roman" w:cs="Times New Roman"/>
+          <w:kern w:val="0"/>
+          <w14:ligatures w14:val="none"/>
+        </w:rPr>
+        <w:t>of HP, Energy, Fullness,</w:t>
+      </w:r>
+      <w:r>
+        <w:rPr>
+          <w:rFonts w:ascii="Times New Roman" w:eastAsia="Times New Roman" w:hAnsi="Times New Roman" w:cs="Times New Roman"/>
+          <w:kern w:val="0"/>
+          <w14:ligatures w14:val="none"/>
+        </w:rPr>
+        <w:t xml:space="preserve"> </w:t>
+      </w:r>
+      <w:r>
+        <w:rPr>
+          <w:rFonts w:ascii="Times New Roman" w:eastAsia="Times New Roman" w:hAnsi="Times New Roman" w:cs="Times New Roman"/>
+          <w:kern w:val="0"/>
+          <w14:ligatures w14:val="none"/>
+        </w:rPr>
+        <w:t>Immunity</w:t>
+      </w:r>
+      <w:r>
+        <w:rPr>
+          <w:rFonts w:ascii="Times New Roman" w:eastAsia="Times New Roman" w:hAnsi="Times New Roman" w:cs="Times New Roman"/>
+          <w:kern w:val="0"/>
+          <w14:ligatures w14:val="none"/>
+        </w:rPr>
+        <w:t>, and Velocity</w:t>
+      </w:r>
+      <w:r>
+        <w:rPr>
+          <w:rFonts w:ascii="Times New Roman" w:eastAsia="Times New Roman" w:hAnsi="Times New Roman" w:cs="Times New Roman"/>
+          <w:kern w:val="0"/>
+          <w14:ligatures w14:val="none"/>
+        </w:rPr>
+        <w:t xml:space="preserve"> of all individuals in the swarm.</w:t>
       </w:r>
     </w:p>
     <w:p>
@@ -3204,7 +3446,6 @@
           <w:kern w:val="0"/>
           <w14:ligatures w14:val="none"/>
         </w:rPr>
-        <w:lastRenderedPageBreak/>
         <w:t>The Weighting Rule:</w:t>
       </w:r>
       <w:r>
@@ -3213,7 +3454,39 @@
           <w:kern w:val="0"/>
           <w14:ligatures w14:val="none"/>
         </w:rPr>
-        <w:t xml:space="preserve"> To prevent the "Starvation Trap," the weights must enforce biological priority.</w:t>
+        <w:t xml:space="preserve"> </w:t>
+      </w:r>
+      <w:r>
+        <w:rPr>
+          <w:rFonts w:ascii="Times New Roman" w:eastAsia="Times New Roman" w:hAnsi="Times New Roman" w:cs="Times New Roman"/>
+          <w:kern w:val="0"/>
+          <w14:ligatures w14:val="none"/>
+        </w:rPr>
+        <w:t xml:space="preserve">The </w:t>
+      </w:r>
+      <w:r>
+        <w:rPr>
+          <w:rFonts w:ascii="Times New Roman" w:eastAsia="Times New Roman" w:hAnsi="Times New Roman" w:cs="Times New Roman"/>
+          <w:kern w:val="0"/>
+          <w14:ligatures w14:val="none"/>
+        </w:rPr>
+        <w:t xml:space="preserve">weights </w:t>
+      </w:r>
+      <w:r>
+        <w:rPr>
+          <w:rFonts w:ascii="Times New Roman" w:eastAsia="Times New Roman" w:hAnsi="Times New Roman" w:cs="Times New Roman"/>
+          <w:kern w:val="0"/>
+          <w14:ligatures w14:val="none"/>
+        </w:rPr>
+        <w:t>enforce</w:t>
+      </w:r>
+      <w:r>
+        <w:rPr>
+          <w:rFonts w:ascii="Times New Roman" w:eastAsia="Times New Roman" w:hAnsi="Times New Roman" w:cs="Times New Roman"/>
+          <w:kern w:val="0"/>
+          <w14:ligatures w14:val="none"/>
+        </w:rPr>
+        <w:t xml:space="preserve"> biological priority.</w:t>
       </w:r>
     </w:p>
     <w:p>
@@ -3257,7 +3530,23 @@
           <w:kern w:val="0"/>
           <w14:ligatures w14:val="none"/>
         </w:rPr>
-        <w:t xml:space="preserve"> (Survival Weight) must be massive (100).</w:t>
+        <w:t xml:space="preserve"> (Survival Weight) must be massive (</w:t>
+      </w:r>
+      <w:r>
+        <w:rPr>
+          <w:rFonts w:ascii="Times New Roman" w:eastAsia="Times New Roman" w:hAnsi="Times New Roman" w:cs="Times New Roman"/>
+          <w:kern w:val="0"/>
+          <w14:ligatures w14:val="none"/>
+        </w:rPr>
+        <w:t>0.5</w:t>
+      </w:r>
+      <w:r>
+        <w:rPr>
+          <w:rFonts w:ascii="Times New Roman" w:eastAsia="Times New Roman" w:hAnsi="Times New Roman" w:cs="Times New Roman"/>
+          <w:kern w:val="0"/>
+          <w14:ligatures w14:val="none"/>
+        </w:rPr>
+        <w:t>0).</w:t>
       </w:r>
     </w:p>
     <w:p>
@@ -3301,7 +3590,23 @@
           <w:kern w:val="0"/>
           <w14:ligatures w14:val="none"/>
         </w:rPr>
-        <w:t xml:space="preserve"> (Condition Weight) should be moderate (50).</w:t>
+        <w:t xml:space="preserve"> (Condition Weight) should be moderate (</w:t>
+      </w:r>
+      <w:r>
+        <w:rPr>
+          <w:rFonts w:ascii="Times New Roman" w:eastAsia="Times New Roman" w:hAnsi="Times New Roman" w:cs="Times New Roman"/>
+          <w:kern w:val="0"/>
+          <w14:ligatures w14:val="none"/>
+        </w:rPr>
+        <w:t>0.35</w:t>
+      </w:r>
+      <w:r>
+        <w:rPr>
+          <w:rFonts w:ascii="Times New Roman" w:eastAsia="Times New Roman" w:hAnsi="Times New Roman" w:cs="Times New Roman"/>
+          <w:kern w:val="0"/>
+          <w14:ligatures w14:val="none"/>
+        </w:rPr>
+        <w:t>).</w:t>
       </w:r>
     </w:p>
     <w:p>
@@ -3345,7 +3650,23 @@
           <w:kern w:val="0"/>
           <w14:ligatures w14:val="none"/>
         </w:rPr>
-        <w:t xml:space="preserve"> (Efficiency Weight) must be low (10).</w:t>
+        <w:t xml:space="preserve"> (Efficiency Weight) must be low (</w:t>
+      </w:r>
+      <w:r>
+        <w:rPr>
+          <w:rFonts w:ascii="Times New Roman" w:eastAsia="Times New Roman" w:hAnsi="Times New Roman" w:cs="Times New Roman"/>
+          <w:kern w:val="0"/>
+          <w14:ligatures w14:val="none"/>
+        </w:rPr>
+        <w:t>0.15</w:t>
+      </w:r>
+      <w:r>
+        <w:rPr>
+          <w:rFonts w:ascii="Times New Roman" w:eastAsia="Times New Roman" w:hAnsi="Times New Roman" w:cs="Times New Roman"/>
+          <w:kern w:val="0"/>
+          <w14:ligatures w14:val="none"/>
+        </w:rPr>
+        <w:t>).</w:t>
       </w:r>
     </w:p>
     <w:p>
@@ -3399,7 +3720,15 @@
           <w:kern w:val="0"/>
           <w14:ligatures w14:val="none"/>
         </w:rPr>
-        <w:t>The configurations of a pond can interact with themselves.</w:t>
+        <w:t>How</w:t>
+      </w:r>
+      <w:r>
+        <w:rPr>
+          <w:rFonts w:ascii="Times New Roman" w:eastAsia="Times New Roman" w:hAnsi="Times New Roman" w:cs="Times New Roman"/>
+          <w:kern w:val="0"/>
+          <w14:ligatures w14:val="none"/>
+        </w:rPr>
+        <w:t xml:space="preserve"> configurations of a pond interact with themselves.</w:t>
       </w:r>
     </w:p>
     <w:p>
@@ -3422,6 +3751,7 @@
           <w:kern w:val="0"/>
           <w14:ligatures w14:val="none"/>
         </w:rPr>
+        <w:lastRenderedPageBreak/>
         <w:t>Food has amount value. Each fish eating reduces this value by one.</w:t>
       </w:r>
     </w:p>
@@ -3514,7 +3844,23 @@
           <w:kern w:val="0"/>
           <w14:ligatures w14:val="none"/>
         </w:rPr>
-        <w:t>Oxygen bubbles can move along the Water Current but does not expire.</w:t>
+        <w:t xml:space="preserve">Oxygen bubbles can move </w:t>
+      </w:r>
+      <w:r>
+        <w:rPr>
+          <w:rFonts w:ascii="Times New Roman" w:eastAsia="Times New Roman" w:hAnsi="Times New Roman" w:cs="Times New Roman"/>
+          <w:kern w:val="0"/>
+          <w14:ligatures w14:val="none"/>
+        </w:rPr>
+        <w:t>randomly</w:t>
+      </w:r>
+      <w:r>
+        <w:rPr>
+          <w:rFonts w:ascii="Times New Roman" w:eastAsia="Times New Roman" w:hAnsi="Times New Roman" w:cs="Times New Roman"/>
+          <w:kern w:val="0"/>
+          <w14:ligatures w14:val="none"/>
+        </w:rPr>
+        <w:t xml:space="preserve"> but does not expire.</w:t>
       </w:r>
     </w:p>
     <w:p>
@@ -3570,15 +3916,47 @@
           <w:kern w:val="0"/>
           <w14:ligatures w14:val="none"/>
         </w:rPr>
-        <w:t xml:space="preserve"> can move along the Water Current but expires</w:t>
-      </w:r>
-      <w:r>
-        <w:rPr>
-          <w:rFonts w:ascii="Times New Roman" w:eastAsia="Times New Roman" w:hAnsi="Times New Roman" w:cs="Times New Roman"/>
-          <w:kern w:val="0"/>
-          <w14:ligatures w14:val="none"/>
-        </w:rPr>
-        <w:t xml:space="preserve">. Once expire, it </w:t>
+        <w:t xml:space="preserve"> can move </w:t>
+      </w:r>
+      <w:r>
+        <w:rPr>
+          <w:rFonts w:ascii="Times New Roman" w:eastAsia="Times New Roman" w:hAnsi="Times New Roman" w:cs="Times New Roman"/>
+          <w:kern w:val="0"/>
+          <w14:ligatures w14:val="none"/>
+        </w:rPr>
+        <w:t>randomly</w:t>
+      </w:r>
+      <w:r>
+        <w:rPr>
+          <w:rFonts w:ascii="Times New Roman" w:eastAsia="Times New Roman" w:hAnsi="Times New Roman" w:cs="Times New Roman"/>
+          <w:kern w:val="0"/>
+          <w14:ligatures w14:val="none"/>
+        </w:rPr>
+        <w:t xml:space="preserve"> but expires</w:t>
+      </w:r>
+      <w:r>
+        <w:rPr>
+          <w:rFonts w:ascii="Times New Roman" w:eastAsia="Times New Roman" w:hAnsi="Times New Roman" w:cs="Times New Roman"/>
+          <w:kern w:val="0"/>
+          <w14:ligatures w14:val="none"/>
+        </w:rPr>
+        <w:t>. Once expire</w:t>
+      </w:r>
+      <w:r>
+        <w:rPr>
+          <w:rFonts w:ascii="Times New Roman" w:eastAsia="Times New Roman" w:hAnsi="Times New Roman" w:cs="Times New Roman"/>
+          <w:kern w:val="0"/>
+          <w14:ligatures w14:val="none"/>
+        </w:rPr>
+        <w:t>d</w:t>
+      </w:r>
+      <w:r>
+        <w:rPr>
+          <w:rFonts w:ascii="Times New Roman" w:eastAsia="Times New Roman" w:hAnsi="Times New Roman" w:cs="Times New Roman"/>
+          <w:kern w:val="0"/>
+          <w14:ligatures w14:val="none"/>
+        </w:rPr>
+        <w:t xml:space="preserve">, it </w:t>
       </w:r>
       <w:r>
         <w:rPr>
@@ -4176,15 +4554,47 @@
           <w:kern w:val="0"/>
           <w14:ligatures w14:val="none"/>
         </w:rPr>
-        <w:t xml:space="preserve"> (cost less Energy if follow water current, cost more if against water current)</w:t>
-      </w:r>
-      <w:r>
-        <w:rPr>
-          <w:rFonts w:ascii="Times New Roman" w:eastAsia="Times New Roman" w:hAnsi="Times New Roman" w:cs="Times New Roman"/>
-          <w:kern w:val="0"/>
-          <w14:ligatures w14:val="none"/>
-        </w:rPr>
-        <w:t>. While Energy &lt;=0, fish’s HP reduces by 1 every timestep. Eating 1 food unit regain 2 energies.</w:t>
+        <w:t xml:space="preserve">. </w:t>
+      </w:r>
+      <w:r>
+        <w:rPr>
+          <w:rFonts w:ascii="Times New Roman" w:eastAsia="Times New Roman" w:hAnsi="Times New Roman" w:cs="Times New Roman"/>
+          <w:kern w:val="0"/>
+          <w14:ligatures w14:val="none"/>
+        </w:rPr>
+        <w:t>While Energy &lt;=0, fish’s HP reduces every timestep. Eating</w:t>
+      </w:r>
+      <w:r>
+        <w:rPr>
+          <w:rFonts w:ascii="Times New Roman" w:eastAsia="Times New Roman" w:hAnsi="Times New Roman" w:cs="Times New Roman"/>
+          <w:kern w:val="0"/>
+          <w14:ligatures w14:val="none"/>
+        </w:rPr>
+        <w:t xml:space="preserve"> </w:t>
+      </w:r>
+      <w:r>
+        <w:rPr>
+          <w:rFonts w:ascii="Times New Roman" w:eastAsia="Times New Roman" w:hAnsi="Times New Roman" w:cs="Times New Roman"/>
+          <w:kern w:val="0"/>
+          <w14:ligatures w14:val="none"/>
+        </w:rPr>
+        <w:t>food unit regain energ</w:t>
+      </w:r>
+      <w:r>
+        <w:rPr>
+          <w:rFonts w:ascii="Times New Roman" w:eastAsia="Times New Roman" w:hAnsi="Times New Roman" w:cs="Times New Roman"/>
+          <w:kern w:val="0"/>
+          <w14:ligatures w14:val="none"/>
+        </w:rPr>
+        <w:t>y with defined amount</w:t>
+      </w:r>
+      <w:r>
+        <w:rPr>
+          <w:rFonts w:ascii="Times New Roman" w:eastAsia="Times New Roman" w:hAnsi="Times New Roman" w:cs="Times New Roman"/>
+          <w:kern w:val="0"/>
+          <w14:ligatures w14:val="none"/>
+        </w:rPr>
+        <w:t>.</w:t>
       </w:r>
     </w:p>
     <w:p>
@@ -4207,7 +4617,7 @@
           <w:kern w:val="0"/>
           <w14:ligatures w14:val="none"/>
         </w:rPr>
-        <w:t>Fullness: Indicates how full a fish’s stomach is. This value decays by 1 every timestep. Regain 1 for each eaten food unit. Stop eating when full. When it is &lt;=0, lose HP instead. If it eats another fish (</w:t>
+        <w:t>Fullness: Indicates how full a fish’s stomach is. This value decays by every timestep. Regain for each eaten food unit. Stop eating when full. When it is &lt;=0, lose HP instead. If it eats another fish (</w:t>
       </w:r>
       <w:r>
         <w:rPr>
@@ -4262,7 +4672,6 @@
           <w:kern w:val="0"/>
           <w14:ligatures w14:val="none"/>
         </w:rPr>
-        <w:lastRenderedPageBreak/>
         <w:t>FecalRate: When fullness &gt; 0, fish has a chance to drop fecal every 2 timestep. The chance increase with the fullness level.</w:t>
       </w:r>
     </w:p>
@@ -4333,7 +4742,7 @@
           <w:kern w:val="0"/>
           <w14:ligatures w14:val="none"/>
         </w:rPr>
-        <w:t>Columnaris disease</w:t>
+        <w:t>disease</w:t>
       </w:r>
       <w:r>
         <w:rPr>
@@ -4349,15 +4758,31 @@
           <w:kern w:val="0"/>
           <w14:ligatures w14:val="none"/>
         </w:rPr>
-        <w:t xml:space="preserve">Fish’s immunity reduces by 1 each timestep if it contacts with Disease area. </w:t>
-      </w:r>
-      <w:r>
-        <w:rPr>
-          <w:rFonts w:ascii="Times New Roman" w:eastAsia="Times New Roman" w:hAnsi="Times New Roman" w:cs="Times New Roman"/>
-          <w:kern w:val="0"/>
-          <w14:ligatures w14:val="none"/>
-        </w:rPr>
-        <w:t>Fish got infections when Immunity &lt;= 0. While in infections, its HP reduces by 1 each timestep. Immunity</w:t>
+        <w:t xml:space="preserve">Fish’s immunity reduces each timestep if it contacts with Disease area. </w:t>
+      </w:r>
+      <w:r>
+        <w:rPr>
+          <w:rFonts w:ascii="Times New Roman" w:eastAsia="Times New Roman" w:hAnsi="Times New Roman" w:cs="Times New Roman"/>
+          <w:kern w:val="0"/>
+          <w14:ligatures w14:val="none"/>
+        </w:rPr>
+        <w:t>Fish got infections when Immunity &lt;= 0. While in infections, its HP reduces</w:t>
+      </w:r>
+      <w:r>
+        <w:rPr>
+          <w:rFonts w:ascii="Times New Roman" w:eastAsia="Times New Roman" w:hAnsi="Times New Roman" w:cs="Times New Roman"/>
+          <w:kern w:val="0"/>
+          <w14:ligatures w14:val="none"/>
+        </w:rPr>
+        <w:t xml:space="preserve"> by</w:t>
+      </w:r>
+      <w:r>
+        <w:rPr>
+          <w:rFonts w:ascii="Times New Roman" w:eastAsia="Times New Roman" w:hAnsi="Times New Roman" w:cs="Times New Roman"/>
+          <w:kern w:val="0"/>
+          <w14:ligatures w14:val="none"/>
+        </w:rPr>
+        <w:t xml:space="preserve"> each timestep. Immunity</w:t>
       </w:r>
       <w:r>
         <w:rPr>
@@ -4397,23 +4822,7 @@
           <w:kern w:val="0"/>
           <w14:ligatures w14:val="none"/>
         </w:rPr>
-        <w:t xml:space="preserve"> boosted up by</w:t>
-      </w:r>
-      <w:r>
-        <w:rPr>
-          <w:rFonts w:ascii="Times New Roman" w:eastAsia="Times New Roman" w:hAnsi="Times New Roman" w:cs="Times New Roman"/>
-          <w:kern w:val="0"/>
-          <w14:ligatures w14:val="none"/>
-        </w:rPr>
-        <w:t xml:space="preserve"> </w:t>
-      </w:r>
-      <w:r>
-        <w:rPr>
-          <w:rFonts w:ascii="Times New Roman" w:eastAsia="Times New Roman" w:hAnsi="Times New Roman" w:cs="Times New Roman"/>
-          <w:kern w:val="0"/>
-          <w14:ligatures w14:val="none"/>
-        </w:rPr>
-        <w:t>3</w:t>
+        <w:t xml:space="preserve"> boosted up</w:t>
       </w:r>
       <w:r>
         <w:rPr>
@@ -4484,7 +4893,15 @@
           <w:kern w:val="0"/>
           <w14:ligatures w14:val="none"/>
         </w:rPr>
-        <w:t xml:space="preserve">current moving </w:t>
+        <w:t>swiming</w:t>
+      </w:r>
+      <w:r>
+        <w:rPr>
+          <w:rFonts w:ascii="Times New Roman" w:eastAsia="Times New Roman" w:hAnsi="Times New Roman" w:cs="Times New Roman"/>
+          <w:kern w:val="0"/>
+          <w14:ligatures w14:val="none"/>
+        </w:rPr>
+        <w:t xml:space="preserve"> </w:t>
       </w:r>
       <w:r>
         <w:rPr>
@@ -4523,6 +4940,7 @@
           <w:kern w:val="0"/>
           <w14:ligatures w14:val="none"/>
         </w:rPr>
+        <w:lastRenderedPageBreak/>
         <w:t>Reduce 50% if HP &lt;= 50%.</w:t>
       </w:r>
     </w:p>
@@ -4574,6 +4992,211 @@
     </w:p>
     <w:p>
       <w:pPr>
+        <w:spacing w:before="100" w:beforeAutospacing="1" w:after="100" w:afterAutospacing="1" w:line="240" w:lineRule="auto"/>
+        <w:rPr>
+          <w:rFonts w:ascii="Times New Roman" w:eastAsia="Times New Roman" w:hAnsi="Times New Roman" w:cs="Times New Roman"/>
+          <w:kern w:val="0"/>
+          <w14:ligatures w14:val="none"/>
+        </w:rPr>
+      </w:pPr>
+      <w:r>
+        <w:rPr>
+          <w:rFonts w:ascii="Times New Roman" w:eastAsia="Times New Roman" w:hAnsi="Times New Roman" w:cs="Times New Roman"/>
+          <w:b/>
+          <w:bCs/>
+          <w:i/>
+          <w:iCs/>
+          <w:color w:val="00B0F0"/>
+          <w:kern w:val="0"/>
+          <w14:ligatures w14:val="none"/>
+        </w:rPr>
+        <w:t>Fish States:</w:t>
+      </w:r>
+      <w:r>
+        <w:rPr>
+          <w:rFonts w:ascii="Times New Roman" w:eastAsia="Times New Roman" w:hAnsi="Times New Roman" w:cs="Times New Roman"/>
+          <w:color w:val="00B0F0"/>
+          <w:kern w:val="0"/>
+          <w14:ligatures w14:val="none"/>
+        </w:rPr>
+        <w:t xml:space="preserve"> </w:t>
+      </w:r>
+      <w:r>
+        <w:rPr>
+          <w:rFonts w:ascii="Times New Roman" w:eastAsia="Times New Roman" w:hAnsi="Times New Roman" w:cs="Times New Roman"/>
+          <w:kern w:val="0"/>
+          <w14:ligatures w14:val="none"/>
+        </w:rPr>
+        <w:t xml:space="preserve">The </w:t>
+      </w:r>
+      <w:r>
+        <w:rPr>
+          <w:rFonts w:ascii="Times New Roman" w:eastAsia="Times New Roman" w:hAnsi="Times New Roman" w:cs="Times New Roman"/>
+          <w:kern w:val="0"/>
+          <w14:ligatures w14:val="none"/>
+        </w:rPr>
+        <w:t>state of a fish that triggers or being triggered in some special conditions. All has initial default value is False.</w:t>
+      </w:r>
+    </w:p>
+    <w:p>
+      <w:pPr>
+        <w:pStyle w:val="ListParagraph"/>
+        <w:numPr>
+          <w:ilvl w:val="0"/>
+          <w:numId w:val="2"/>
+        </w:numPr>
+        <w:spacing w:before="100" w:beforeAutospacing="1" w:after="100" w:afterAutospacing="1" w:line="240" w:lineRule="auto"/>
+        <w:rPr>
+          <w:rFonts w:ascii="Times New Roman" w:eastAsia="Times New Roman" w:hAnsi="Times New Roman" w:cs="Times New Roman"/>
+          <w:kern w:val="0"/>
+          <w14:ligatures w14:val="none"/>
+        </w:rPr>
+      </w:pPr>
+      <w:r>
+        <w:rPr>
+          <w:rFonts w:ascii="Times New Roman" w:eastAsia="Times New Roman" w:hAnsi="Times New Roman" w:cs="Times New Roman"/>
+          <w:kern w:val="0"/>
+          <w14:ligatures w14:val="none"/>
+        </w:rPr>
+        <w:t>isBoosting: True for 5 timestep since a fish just eat</w:t>
+      </w:r>
+      <w:r>
+        <w:rPr>
+          <w:rFonts w:ascii="Times New Roman" w:eastAsia="Times New Roman" w:hAnsi="Times New Roman" w:cs="Times New Roman"/>
+          <w:kern w:val="0"/>
+          <w14:ligatures w14:val="none"/>
+        </w:rPr>
+        <w:t>s</w:t>
+      </w:r>
+      <w:r>
+        <w:rPr>
+          <w:rFonts w:ascii="Times New Roman" w:eastAsia="Times New Roman" w:hAnsi="Times New Roman" w:cs="Times New Roman"/>
+          <w:kern w:val="0"/>
+          <w14:ligatures w14:val="none"/>
+        </w:rPr>
+        <w:t xml:space="preserve"> probiotic food. Overeating probiotic does not stac</w:t>
+      </w:r>
+      <w:r>
+        <w:rPr>
+          <w:rFonts w:ascii="Times New Roman" w:eastAsia="Times New Roman" w:hAnsi="Times New Roman" w:cs="Times New Roman"/>
+          <w:kern w:val="0"/>
+          <w14:ligatures w14:val="none"/>
+        </w:rPr>
+        <w:t>k effect but refresh the duration.</w:t>
+      </w:r>
+    </w:p>
+    <w:p>
+      <w:pPr>
+        <w:pStyle w:val="ListParagraph"/>
+        <w:numPr>
+          <w:ilvl w:val="0"/>
+          <w:numId w:val="2"/>
+        </w:numPr>
+        <w:spacing w:before="100" w:beforeAutospacing="1" w:after="100" w:afterAutospacing="1" w:line="240" w:lineRule="auto"/>
+        <w:rPr>
+          <w:rFonts w:ascii="Times New Roman" w:eastAsia="Times New Roman" w:hAnsi="Times New Roman" w:cs="Times New Roman"/>
+          <w:kern w:val="0"/>
+          <w14:ligatures w14:val="none"/>
+        </w:rPr>
+      </w:pPr>
+      <w:r>
+        <w:rPr>
+          <w:rFonts w:ascii="Times New Roman" w:eastAsia="Times New Roman" w:hAnsi="Times New Roman" w:cs="Times New Roman"/>
+          <w:kern w:val="0"/>
+          <w14:ligatures w14:val="none"/>
+        </w:rPr>
+        <w:t xml:space="preserve">isInfected: True if a fish is infected. An infected fish becomes the new infected source with a small Disease </w:t>
+      </w:r>
+      <w:r>
+        <w:rPr>
+          <w:rFonts w:ascii="Times New Roman" w:eastAsia="Times New Roman" w:hAnsi="Times New Roman" w:cs="Times New Roman"/>
+          <w:kern w:val="0"/>
+          <w14:ligatures w14:val="none"/>
+        </w:rPr>
+        <w:t>A</w:t>
+      </w:r>
+      <w:r>
+        <w:rPr>
+          <w:rFonts w:ascii="Times New Roman" w:eastAsia="Times New Roman" w:hAnsi="Times New Roman" w:cs="Times New Roman"/>
+          <w:kern w:val="0"/>
+          <w14:ligatures w14:val="none"/>
+        </w:rPr>
+        <w:t>rea.</w:t>
+      </w:r>
+    </w:p>
+    <w:p>
+      <w:pPr>
+        <w:pStyle w:val="ListParagraph"/>
+        <w:numPr>
+          <w:ilvl w:val="0"/>
+          <w:numId w:val="2"/>
+        </w:numPr>
+        <w:spacing w:before="100" w:beforeAutospacing="1" w:after="100" w:afterAutospacing="1" w:line="240" w:lineRule="auto"/>
+        <w:rPr>
+          <w:rFonts w:ascii="Times New Roman" w:eastAsia="Times New Roman" w:hAnsi="Times New Roman" w:cs="Times New Roman"/>
+          <w:kern w:val="0"/>
+          <w14:ligatures w14:val="none"/>
+        </w:rPr>
+      </w:pPr>
+      <w:r>
+        <w:rPr>
+          <w:rFonts w:ascii="Times New Roman" w:eastAsia="Times New Roman" w:hAnsi="Times New Roman" w:cs="Times New Roman"/>
+          <w:kern w:val="0"/>
+          <w14:ligatures w14:val="none"/>
+        </w:rPr>
+        <w:t xml:space="preserve">hasParasite: True if a fish has parasites. </w:t>
+      </w:r>
+      <w:r>
+        <w:rPr>
+          <w:rFonts w:ascii="Times New Roman" w:eastAsia="Times New Roman" w:hAnsi="Times New Roman" w:cs="Times New Roman"/>
+          <w:kern w:val="0"/>
+          <w14:ligatures w14:val="none"/>
+        </w:rPr>
+        <w:t xml:space="preserve">While in this state, a fish has a high chance to overwrite the the PSO Swarm’s action </w:t>
+      </w:r>
+      <w:r>
+        <w:rPr>
+          <w:rFonts w:ascii="Times New Roman" w:eastAsia="Times New Roman" w:hAnsi="Times New Roman" w:cs="Times New Roman"/>
+          <w:kern w:val="0"/>
+          <w14:ligatures w14:val="none"/>
+        </w:rPr>
+        <w:t>scrub</w:t>
+      </w:r>
+      <w:r>
+        <w:rPr>
+          <w:rFonts w:ascii="Times New Roman" w:eastAsia="Times New Roman" w:hAnsi="Times New Roman" w:cs="Times New Roman"/>
+          <w:kern w:val="0"/>
+          <w14:ligatures w14:val="none"/>
+        </w:rPr>
+        <w:t>bing</w:t>
+      </w:r>
+      <w:r>
+        <w:rPr>
+          <w:rFonts w:ascii="Times New Roman" w:eastAsia="Times New Roman" w:hAnsi="Times New Roman" w:cs="Times New Roman"/>
+          <w:kern w:val="0"/>
+          <w14:ligatures w14:val="none"/>
+        </w:rPr>
+        <w:t xml:space="preserve"> themselves against hard surface like obstacles to get rid of them</w:t>
+      </w:r>
+      <w:r>
+        <w:rPr>
+          <w:rFonts w:ascii="Times New Roman" w:eastAsia="Times New Roman" w:hAnsi="Times New Roman" w:cs="Times New Roman"/>
+          <w:kern w:val="0"/>
+          <w14:ligatures w14:val="none"/>
+        </w:rPr>
+        <w:t>.</w:t>
+      </w:r>
+      <w:r>
+        <w:rPr>
+          <w:rFonts w:ascii="Times New Roman" w:eastAsia="Times New Roman" w:hAnsi="Times New Roman" w:cs="Times New Roman"/>
+          <w:kern w:val="0"/>
+          <w14:ligatures w14:val="none"/>
+        </w:rPr>
+        <w:t xml:space="preserve"> Importantly, this state weakens and hurts the fish:</w:t>
+      </w:r>
+    </w:p>
+    <w:p>
+      <w:pPr>
         <w:pStyle w:val="ListParagraph"/>
         <w:numPr>
           <w:ilvl w:val="1"/>
@@ -4592,7 +5215,7 @@
           <w:kern w:val="0"/>
           <w14:ligatures w14:val="none"/>
         </w:rPr>
-        <w:t>Reduce 50% if against water current</w:t>
+        <w:t>Reduce Fullness efficiency by 50%</w:t>
       </w:r>
     </w:p>
     <w:p>
@@ -4615,19 +5238,254 @@
           <w:kern w:val="0"/>
           <w14:ligatures w14:val="none"/>
         </w:rPr>
-        <w:t>Increase 50% if follow water current</w:t>
-      </w:r>
-    </w:p>
-    <w:p>
-      <w:pPr>
-        <w:spacing w:before="100" w:beforeAutospacing="1" w:after="100" w:afterAutospacing="1" w:line="240" w:lineRule="auto"/>
-        <w:rPr>
-          <w:rFonts w:ascii="Times New Roman" w:eastAsia="Times New Roman" w:hAnsi="Times New Roman" w:cs="Times New Roman"/>
-          <w:kern w:val="0"/>
-          <w14:ligatures w14:val="none"/>
-        </w:rPr>
-      </w:pPr>
-      <w:r>
+        <w:t>Drains extra 50% fullness per time-step</w:t>
+      </w:r>
+    </w:p>
+    <w:p>
+      <w:pPr>
+        <w:pStyle w:val="ListParagraph"/>
+        <w:numPr>
+          <w:ilvl w:val="1"/>
+          <w:numId w:val="2"/>
+        </w:numPr>
+        <w:spacing w:before="100" w:beforeAutospacing="1" w:after="100" w:afterAutospacing="1" w:line="240" w:lineRule="auto"/>
+        <w:rPr>
+          <w:rFonts w:ascii="Times New Roman" w:eastAsia="Times New Roman" w:hAnsi="Times New Roman" w:cs="Times New Roman"/>
+          <w:kern w:val="0"/>
+          <w14:ligatures w14:val="none"/>
+        </w:rPr>
+      </w:pPr>
+      <w:r>
+        <w:rPr>
+          <w:rFonts w:ascii="Times New Roman" w:eastAsia="Times New Roman" w:hAnsi="Times New Roman" w:cs="Times New Roman"/>
+          <w:kern w:val="0"/>
+          <w14:ligatures w14:val="none"/>
+        </w:rPr>
+        <w:t>Drains extra 50% energy cost</w:t>
+      </w:r>
+    </w:p>
+    <w:p>
+      <w:pPr>
+        <w:pStyle w:val="ListParagraph"/>
+        <w:numPr>
+          <w:ilvl w:val="1"/>
+          <w:numId w:val="2"/>
+        </w:numPr>
+        <w:spacing w:before="100" w:beforeAutospacing="1" w:after="100" w:afterAutospacing="1" w:line="240" w:lineRule="auto"/>
+        <w:rPr>
+          <w:rFonts w:ascii="Times New Roman" w:eastAsia="Times New Roman" w:hAnsi="Times New Roman" w:cs="Times New Roman"/>
+          <w:kern w:val="0"/>
+          <w14:ligatures w14:val="none"/>
+        </w:rPr>
+      </w:pPr>
+      <w:r>
+        <w:rPr>
+          <w:rFonts w:ascii="Times New Roman" w:eastAsia="Times New Roman" w:hAnsi="Times New Roman" w:cs="Times New Roman"/>
+          <w:kern w:val="0"/>
+          <w14:ligatures w14:val="none"/>
+        </w:rPr>
+        <w:t>Drains</w:t>
+      </w:r>
+      <w:r>
+        <w:rPr>
+          <w:rFonts w:ascii="Times New Roman" w:eastAsia="Times New Roman" w:hAnsi="Times New Roman" w:cs="Times New Roman"/>
+          <w:kern w:val="0"/>
+          <w14:ligatures w14:val="none"/>
+        </w:rPr>
+        <w:t xml:space="preserve"> </w:t>
+      </w:r>
+      <w:r>
+        <w:rPr>
+          <w:rFonts w:ascii="Times New Roman" w:eastAsia="Times New Roman" w:hAnsi="Times New Roman" w:cs="Times New Roman"/>
+          <w:kern w:val="0"/>
+          <w14:ligatures w14:val="none"/>
+        </w:rPr>
+        <w:t>HP every 3 time-step (mimic slow death)</w:t>
+      </w:r>
+    </w:p>
+    <w:p>
+      <w:pPr>
+        <w:pStyle w:val="ListParagraph"/>
+        <w:numPr>
+          <w:ilvl w:val="1"/>
+          <w:numId w:val="2"/>
+        </w:numPr>
+        <w:spacing w:before="100" w:beforeAutospacing="1" w:after="100" w:afterAutospacing="1" w:line="240" w:lineRule="auto"/>
+        <w:rPr>
+          <w:rFonts w:ascii="Times New Roman" w:eastAsia="Times New Roman" w:hAnsi="Times New Roman" w:cs="Times New Roman"/>
+          <w:kern w:val="0"/>
+          <w14:ligatures w14:val="none"/>
+        </w:rPr>
+      </w:pPr>
+      <w:r>
+        <w:rPr>
+          <w:rFonts w:ascii="Times New Roman" w:eastAsia="Times New Roman" w:hAnsi="Times New Roman" w:cs="Times New Roman"/>
+          <w:kern w:val="0"/>
+          <w14:ligatures w14:val="none"/>
+        </w:rPr>
+        <w:t>Reduce 25% velocity</w:t>
+      </w:r>
+    </w:p>
+    <w:p>
+      <w:pPr>
+        <w:pStyle w:val="ListParagraph"/>
+        <w:numPr>
+          <w:ilvl w:val="0"/>
+          <w:numId w:val="2"/>
+        </w:numPr>
+        <w:rPr>
+          <w:rFonts w:ascii="Times New Roman" w:eastAsia="Times New Roman" w:hAnsi="Times New Roman" w:cs="Times New Roman"/>
+          <w:kern w:val="0"/>
+          <w14:ligatures w14:val="none"/>
+        </w:rPr>
+      </w:pPr>
+      <w:r>
+        <w:rPr>
+          <w:rFonts w:ascii="Times New Roman" w:eastAsia="Times New Roman" w:hAnsi="Times New Roman" w:cs="Times New Roman"/>
+          <w:kern w:val="0"/>
+          <w14:ligatures w14:val="none"/>
+        </w:rPr>
+        <w:t xml:space="preserve">isRunning: True if a fish feel threatens by another fish. While in this </w:t>
+      </w:r>
+      <w:r>
+        <w:rPr>
+          <w:rFonts w:ascii="Times New Roman" w:eastAsia="Times New Roman" w:hAnsi="Times New Roman" w:cs="Times New Roman"/>
+          <w:kern w:val="0"/>
+          <w14:ligatures w14:val="none"/>
+        </w:rPr>
+        <w:t>state</w:t>
+      </w:r>
+      <w:r>
+        <w:rPr>
+          <w:rFonts w:ascii="Times New Roman" w:eastAsia="Times New Roman" w:hAnsi="Times New Roman" w:cs="Times New Roman"/>
+          <w:kern w:val="0"/>
+          <w14:ligatures w14:val="none"/>
+        </w:rPr>
+        <w:t>, a fish has a high chance to overwrite the the PSO Swarm’s action with running action away from the dangerous nearby valid targets (the one with MouthSize larger than the running’s BodySize).</w:t>
+      </w:r>
+      <w:r>
+        <w:rPr>
+          <w:rFonts w:ascii="Times New Roman" w:eastAsia="Times New Roman" w:hAnsi="Times New Roman" w:cs="Times New Roman"/>
+          <w:kern w:val="0"/>
+          <w14:ligatures w14:val="none"/>
+        </w:rPr>
+        <w:t xml:space="preserve"> Increase 50% </w:t>
+      </w:r>
+      <w:r>
+        <w:rPr>
+          <w:rFonts w:ascii="Times New Roman" w:eastAsia="Times New Roman" w:hAnsi="Times New Roman" w:cs="Times New Roman"/>
+          <w:kern w:val="0"/>
+          <w14:ligatures w14:val="none"/>
+        </w:rPr>
+        <w:t>velocity but cost 50</w:t>
+      </w:r>
+      <w:r>
+        <w:rPr>
+          <w:rFonts w:ascii="Times New Roman" w:eastAsia="Times New Roman" w:hAnsi="Times New Roman" w:cs="Times New Roman"/>
+          <w:kern w:val="0"/>
+          <w14:ligatures w14:val="none"/>
+        </w:rPr>
+        <w:t>%</w:t>
+      </w:r>
+      <w:r>
+        <w:rPr>
+          <w:rFonts w:ascii="Times New Roman" w:eastAsia="Times New Roman" w:hAnsi="Times New Roman" w:cs="Times New Roman"/>
+          <w:kern w:val="0"/>
+          <w14:ligatures w14:val="none"/>
+        </w:rPr>
+        <w:t xml:space="preserve"> more energy</w:t>
+      </w:r>
+      <w:r>
+        <w:rPr>
+          <w:rFonts w:ascii="Times New Roman" w:eastAsia="Times New Roman" w:hAnsi="Times New Roman" w:cs="Times New Roman"/>
+          <w:kern w:val="0"/>
+          <w14:ligatures w14:val="none"/>
+        </w:rPr>
+        <w:t xml:space="preserve"> per time-step</w:t>
+      </w:r>
+      <w:r>
+        <w:rPr>
+          <w:rFonts w:ascii="Times New Roman" w:eastAsia="Times New Roman" w:hAnsi="Times New Roman" w:cs="Times New Roman"/>
+          <w:kern w:val="0"/>
+          <w14:ligatures w14:val="none"/>
+        </w:rPr>
+        <w:t>, buff ends if running out of energy.</w:t>
+      </w:r>
+    </w:p>
+    <w:p>
+      <w:pPr>
+        <w:pStyle w:val="ListParagraph"/>
+        <w:numPr>
+          <w:ilvl w:val="0"/>
+          <w:numId w:val="2"/>
+        </w:numPr>
+        <w:spacing w:before="100" w:beforeAutospacing="1" w:after="100" w:afterAutospacing="1" w:line="240" w:lineRule="auto"/>
+        <w:rPr>
+          <w:rFonts w:ascii="Times New Roman" w:eastAsia="Times New Roman" w:hAnsi="Times New Roman" w:cs="Times New Roman"/>
+          <w:kern w:val="0"/>
+          <w14:ligatures w14:val="none"/>
+        </w:rPr>
+      </w:pPr>
+      <w:r>
+        <w:rPr>
+          <w:rFonts w:ascii="Times New Roman" w:eastAsia="Times New Roman" w:hAnsi="Times New Roman" w:cs="Times New Roman"/>
+          <w:kern w:val="0"/>
+          <w14:ligatures w14:val="none"/>
+        </w:rPr>
+        <w:t>isHunting</w:t>
+      </w:r>
+      <w:r>
+        <w:rPr>
+          <w:rFonts w:ascii="Times New Roman" w:eastAsia="Times New Roman" w:hAnsi="Times New Roman" w:cs="Times New Roman"/>
+          <w:kern w:val="0"/>
+          <w14:ligatures w14:val="none"/>
+        </w:rPr>
+        <w:t xml:space="preserve">: True if a fish trigger cannibal mode. While in this </w:t>
+      </w:r>
+      <w:r>
+        <w:rPr>
+          <w:rFonts w:ascii="Times New Roman" w:eastAsia="Times New Roman" w:hAnsi="Times New Roman" w:cs="Times New Roman"/>
+          <w:kern w:val="0"/>
+          <w14:ligatures w14:val="none"/>
+        </w:rPr>
+        <w:t>state</w:t>
+      </w:r>
+      <w:r>
+        <w:rPr>
+          <w:rFonts w:ascii="Times New Roman" w:eastAsia="Times New Roman" w:hAnsi="Times New Roman" w:cs="Times New Roman"/>
+          <w:kern w:val="0"/>
+          <w14:ligatures w14:val="none"/>
+        </w:rPr>
+        <w:t>, a fish has a high chance to overwrite the the PSO Swarm’s action with hunting action on nearby valid targets (the one with BodySize smaller than the hunting’s BodySize).</w:t>
+      </w:r>
+      <w:r>
+        <w:rPr>
+          <w:rFonts w:ascii="Times New Roman" w:eastAsia="Times New Roman" w:hAnsi="Times New Roman" w:cs="Times New Roman"/>
+          <w:kern w:val="0"/>
+          <w14:ligatures w14:val="none"/>
+        </w:rPr>
+        <w:t xml:space="preserve"> </w:t>
+      </w:r>
+      <w:r>
+        <w:rPr>
+          <w:rFonts w:ascii="Times New Roman" w:eastAsia="Times New Roman" w:hAnsi="Times New Roman" w:cs="Times New Roman"/>
+          <w:kern w:val="0"/>
+          <w14:ligatures w14:val="none"/>
+        </w:rPr>
+        <w:t xml:space="preserve">Increase 50% </w:t>
+      </w:r>
+      <w:r>
+        <w:rPr>
+          <w:rFonts w:ascii="Times New Roman" w:eastAsia="Times New Roman" w:hAnsi="Times New Roman" w:cs="Times New Roman"/>
+          <w:kern w:val="0"/>
+          <w14:ligatures w14:val="none"/>
+        </w:rPr>
+        <w:t>velocity but cost 50% more energy per time-step, buff ends if running out of energy.</w:t>
+      </w:r>
+    </w:p>
+    <w:p>
+      <w:pPr>
+        <w:spacing w:before="100" w:beforeAutospacing="1" w:after="100" w:afterAutospacing="1" w:line="240" w:lineRule="auto"/>
         <w:rPr>
           <w:rFonts w:ascii="Times New Roman" w:eastAsia="Times New Roman" w:hAnsi="Times New Roman" w:cs="Times New Roman"/>
           <w:b/>
@@ -4638,482 +5496,8 @@
           <w:kern w:val="0"/>
           <w14:ligatures w14:val="none"/>
         </w:rPr>
-        <w:t>Fish States:</w:t>
-      </w:r>
-      <w:r>
-        <w:rPr>
-          <w:rFonts w:ascii="Times New Roman" w:eastAsia="Times New Roman" w:hAnsi="Times New Roman" w:cs="Times New Roman"/>
-          <w:color w:val="00B0F0"/>
-          <w:kern w:val="0"/>
-          <w14:ligatures w14:val="none"/>
-        </w:rPr>
-        <w:t xml:space="preserve"> </w:t>
-      </w:r>
-      <w:r>
-        <w:rPr>
-          <w:rFonts w:ascii="Times New Roman" w:eastAsia="Times New Roman" w:hAnsi="Times New Roman" w:cs="Times New Roman"/>
-          <w:kern w:val="0"/>
-          <w14:ligatures w14:val="none"/>
-        </w:rPr>
-        <w:t xml:space="preserve">The </w:t>
-      </w:r>
-      <w:r>
-        <w:rPr>
-          <w:rFonts w:ascii="Times New Roman" w:eastAsia="Times New Roman" w:hAnsi="Times New Roman" w:cs="Times New Roman"/>
-          <w:kern w:val="0"/>
-          <w14:ligatures w14:val="none"/>
-        </w:rPr>
-        <w:t>state of a fish that triggers or being triggered in some special conditions. All has initial default value is False.</w:t>
-      </w:r>
-    </w:p>
-    <w:p>
-      <w:pPr>
-        <w:pStyle w:val="ListParagraph"/>
-        <w:numPr>
-          <w:ilvl w:val="0"/>
-          <w:numId w:val="2"/>
-        </w:numPr>
-        <w:spacing w:before="100" w:beforeAutospacing="1" w:after="100" w:afterAutospacing="1" w:line="240" w:lineRule="auto"/>
-        <w:rPr>
-          <w:rFonts w:ascii="Times New Roman" w:eastAsia="Times New Roman" w:hAnsi="Times New Roman" w:cs="Times New Roman"/>
-          <w:kern w:val="0"/>
-          <w14:ligatures w14:val="none"/>
-        </w:rPr>
-      </w:pPr>
-      <w:r>
-        <w:rPr>
-          <w:rFonts w:ascii="Times New Roman" w:eastAsia="Times New Roman" w:hAnsi="Times New Roman" w:cs="Times New Roman"/>
-          <w:kern w:val="0"/>
-          <w14:ligatures w14:val="none"/>
-        </w:rPr>
-        <w:t>isBoosting: True for 5 timestep since a fish just eat</w:t>
-      </w:r>
-      <w:r>
-        <w:rPr>
-          <w:rFonts w:ascii="Times New Roman" w:eastAsia="Times New Roman" w:hAnsi="Times New Roman" w:cs="Times New Roman"/>
-          <w:kern w:val="0"/>
-          <w14:ligatures w14:val="none"/>
-        </w:rPr>
-        <w:t>s</w:t>
-      </w:r>
-      <w:r>
-        <w:rPr>
-          <w:rFonts w:ascii="Times New Roman" w:eastAsia="Times New Roman" w:hAnsi="Times New Roman" w:cs="Times New Roman"/>
-          <w:kern w:val="0"/>
-          <w14:ligatures w14:val="none"/>
-        </w:rPr>
-        <w:t xml:space="preserve"> probiotic food. Overeating probiotic does not stac</w:t>
-      </w:r>
-      <w:r>
-        <w:rPr>
-          <w:rFonts w:ascii="Times New Roman" w:eastAsia="Times New Roman" w:hAnsi="Times New Roman" w:cs="Times New Roman"/>
-          <w:kern w:val="0"/>
-          <w14:ligatures w14:val="none"/>
-        </w:rPr>
-        <w:t>k effect but refresh the duration.</w:t>
-      </w:r>
-    </w:p>
-    <w:p>
-      <w:pPr>
-        <w:pStyle w:val="ListParagraph"/>
-        <w:numPr>
-          <w:ilvl w:val="0"/>
-          <w:numId w:val="2"/>
-        </w:numPr>
-        <w:spacing w:before="100" w:beforeAutospacing="1" w:after="100" w:afterAutospacing="1" w:line="240" w:lineRule="auto"/>
-        <w:rPr>
-          <w:rFonts w:ascii="Times New Roman" w:eastAsia="Times New Roman" w:hAnsi="Times New Roman" w:cs="Times New Roman"/>
-          <w:kern w:val="0"/>
-          <w14:ligatures w14:val="none"/>
-        </w:rPr>
-      </w:pPr>
-      <w:r>
-        <w:rPr>
-          <w:rFonts w:ascii="Times New Roman" w:eastAsia="Times New Roman" w:hAnsi="Times New Roman" w:cs="Times New Roman"/>
-          <w:kern w:val="0"/>
-          <w14:ligatures w14:val="none"/>
-        </w:rPr>
-        <w:t xml:space="preserve">isInfected: True if a fish is infected. An infected fish becomes the new infected source with a small Disease </w:t>
-      </w:r>
-      <w:r>
-        <w:rPr>
-          <w:rFonts w:ascii="Times New Roman" w:eastAsia="Times New Roman" w:hAnsi="Times New Roman" w:cs="Times New Roman"/>
-          <w:kern w:val="0"/>
-          <w14:ligatures w14:val="none"/>
-        </w:rPr>
-        <w:t>A</w:t>
-      </w:r>
-      <w:r>
-        <w:rPr>
-          <w:rFonts w:ascii="Times New Roman" w:eastAsia="Times New Roman" w:hAnsi="Times New Roman" w:cs="Times New Roman"/>
-          <w:kern w:val="0"/>
-          <w14:ligatures w14:val="none"/>
-        </w:rPr>
-        <w:t>rea.</w:t>
-      </w:r>
-    </w:p>
-    <w:p>
-      <w:pPr>
-        <w:pStyle w:val="ListParagraph"/>
-        <w:numPr>
-          <w:ilvl w:val="0"/>
-          <w:numId w:val="2"/>
-        </w:numPr>
-        <w:spacing w:before="100" w:beforeAutospacing="1" w:after="100" w:afterAutospacing="1" w:line="240" w:lineRule="auto"/>
-        <w:rPr>
-          <w:rFonts w:ascii="Times New Roman" w:eastAsia="Times New Roman" w:hAnsi="Times New Roman" w:cs="Times New Roman"/>
-          <w:kern w:val="0"/>
-          <w14:ligatures w14:val="none"/>
-        </w:rPr>
-      </w:pPr>
-      <w:r>
-        <w:rPr>
-          <w:rFonts w:ascii="Times New Roman" w:eastAsia="Times New Roman" w:hAnsi="Times New Roman" w:cs="Times New Roman"/>
-          <w:kern w:val="0"/>
-          <w14:ligatures w14:val="none"/>
-        </w:rPr>
-        <w:t xml:space="preserve">hasParasite: True if a fish has parasites. </w:t>
-      </w:r>
-      <w:r>
-        <w:rPr>
-          <w:rFonts w:ascii="Times New Roman" w:eastAsia="Times New Roman" w:hAnsi="Times New Roman" w:cs="Times New Roman"/>
-          <w:kern w:val="0"/>
-          <w14:ligatures w14:val="none"/>
-        </w:rPr>
-        <w:t xml:space="preserve">While in this state, a fish has a high chance to overwrite the the PSO Swarm’s action </w:t>
-      </w:r>
-      <w:r>
-        <w:rPr>
-          <w:rFonts w:ascii="Times New Roman" w:eastAsia="Times New Roman" w:hAnsi="Times New Roman" w:cs="Times New Roman"/>
-          <w:kern w:val="0"/>
-          <w14:ligatures w14:val="none"/>
-        </w:rPr>
-        <w:t>scrub</w:t>
-      </w:r>
-      <w:r>
-        <w:rPr>
-          <w:rFonts w:ascii="Times New Roman" w:eastAsia="Times New Roman" w:hAnsi="Times New Roman" w:cs="Times New Roman"/>
-          <w:kern w:val="0"/>
-          <w14:ligatures w14:val="none"/>
-        </w:rPr>
-        <w:t>bing</w:t>
-      </w:r>
-      <w:r>
-        <w:rPr>
-          <w:rFonts w:ascii="Times New Roman" w:eastAsia="Times New Roman" w:hAnsi="Times New Roman" w:cs="Times New Roman"/>
-          <w:kern w:val="0"/>
-          <w14:ligatures w14:val="none"/>
-        </w:rPr>
-        <w:t xml:space="preserve"> themselves against hard surface like obstacles to get rid of them</w:t>
-      </w:r>
-      <w:r>
-        <w:rPr>
-          <w:rFonts w:ascii="Times New Roman" w:eastAsia="Times New Roman" w:hAnsi="Times New Roman" w:cs="Times New Roman"/>
-          <w:kern w:val="0"/>
-          <w14:ligatures w14:val="none"/>
-        </w:rPr>
-        <w:t>.</w:t>
-      </w:r>
-      <w:r>
-        <w:rPr>
-          <w:rFonts w:ascii="Times New Roman" w:eastAsia="Times New Roman" w:hAnsi="Times New Roman" w:cs="Times New Roman"/>
-          <w:kern w:val="0"/>
-          <w14:ligatures w14:val="none"/>
-        </w:rPr>
-        <w:t xml:space="preserve"> Importantly, this state weakens and hurts the fish:</w:t>
-      </w:r>
-    </w:p>
-    <w:p>
-      <w:pPr>
-        <w:pStyle w:val="ListParagraph"/>
-        <w:numPr>
-          <w:ilvl w:val="1"/>
-          <w:numId w:val="2"/>
-        </w:numPr>
-        <w:spacing w:before="100" w:beforeAutospacing="1" w:after="100" w:afterAutospacing="1" w:line="240" w:lineRule="auto"/>
-        <w:rPr>
-          <w:rFonts w:ascii="Times New Roman" w:eastAsia="Times New Roman" w:hAnsi="Times New Roman" w:cs="Times New Roman"/>
-          <w:kern w:val="0"/>
-          <w14:ligatures w14:val="none"/>
-        </w:rPr>
-      </w:pPr>
-      <w:r>
-        <w:rPr>
-          <w:rFonts w:ascii="Times New Roman" w:eastAsia="Times New Roman" w:hAnsi="Times New Roman" w:cs="Times New Roman"/>
-          <w:kern w:val="0"/>
-          <w14:ligatures w14:val="none"/>
-        </w:rPr>
-        <w:t>Reduce Fullness efficiency by 50%</w:t>
-      </w:r>
-    </w:p>
-    <w:p>
-      <w:pPr>
-        <w:pStyle w:val="ListParagraph"/>
-        <w:numPr>
-          <w:ilvl w:val="1"/>
-          <w:numId w:val="2"/>
-        </w:numPr>
-        <w:spacing w:before="100" w:beforeAutospacing="1" w:after="100" w:afterAutospacing="1" w:line="240" w:lineRule="auto"/>
-        <w:rPr>
-          <w:rFonts w:ascii="Times New Roman" w:eastAsia="Times New Roman" w:hAnsi="Times New Roman" w:cs="Times New Roman"/>
-          <w:kern w:val="0"/>
-          <w14:ligatures w14:val="none"/>
-        </w:rPr>
-      </w:pPr>
-      <w:r>
-        <w:rPr>
-          <w:rFonts w:ascii="Times New Roman" w:eastAsia="Times New Roman" w:hAnsi="Times New Roman" w:cs="Times New Roman"/>
-          <w:kern w:val="0"/>
-          <w14:ligatures w14:val="none"/>
-        </w:rPr>
-        <w:t>Drains extra 50% fullness per time-step</w:t>
-      </w:r>
-    </w:p>
-    <w:p>
-      <w:pPr>
-        <w:pStyle w:val="ListParagraph"/>
-        <w:numPr>
-          <w:ilvl w:val="1"/>
-          <w:numId w:val="2"/>
-        </w:numPr>
-        <w:spacing w:before="100" w:beforeAutospacing="1" w:after="100" w:afterAutospacing="1" w:line="240" w:lineRule="auto"/>
-        <w:rPr>
-          <w:rFonts w:ascii="Times New Roman" w:eastAsia="Times New Roman" w:hAnsi="Times New Roman" w:cs="Times New Roman"/>
-          <w:kern w:val="0"/>
-          <w14:ligatures w14:val="none"/>
-        </w:rPr>
-      </w:pPr>
-      <w:r>
-        <w:rPr>
-          <w:rFonts w:ascii="Times New Roman" w:eastAsia="Times New Roman" w:hAnsi="Times New Roman" w:cs="Times New Roman"/>
-          <w:kern w:val="0"/>
-          <w14:ligatures w14:val="none"/>
-        </w:rPr>
-        <w:t>Drains extra 50% energy cost</w:t>
-      </w:r>
-    </w:p>
-    <w:p>
-      <w:pPr>
-        <w:pStyle w:val="ListParagraph"/>
-        <w:numPr>
-          <w:ilvl w:val="1"/>
-          <w:numId w:val="2"/>
-        </w:numPr>
-        <w:spacing w:before="100" w:beforeAutospacing="1" w:after="100" w:afterAutospacing="1" w:line="240" w:lineRule="auto"/>
-        <w:rPr>
-          <w:rFonts w:ascii="Times New Roman" w:eastAsia="Times New Roman" w:hAnsi="Times New Roman" w:cs="Times New Roman"/>
-          <w:kern w:val="0"/>
-          <w14:ligatures w14:val="none"/>
-        </w:rPr>
-      </w:pPr>
-      <w:r>
-        <w:rPr>
-          <w:rFonts w:ascii="Times New Roman" w:eastAsia="Times New Roman" w:hAnsi="Times New Roman" w:cs="Times New Roman"/>
-          <w:kern w:val="0"/>
-          <w14:ligatures w14:val="none"/>
-        </w:rPr>
-        <w:t xml:space="preserve">Drains </w:t>
-      </w:r>
-      <w:r>
-        <w:rPr>
-          <w:rFonts w:ascii="Times New Roman" w:eastAsia="Times New Roman" w:hAnsi="Times New Roman" w:cs="Times New Roman"/>
-          <w:kern w:val="0"/>
-          <w14:ligatures w14:val="none"/>
-        </w:rPr>
-        <w:t xml:space="preserve">1 </w:t>
-      </w:r>
-      <w:r>
-        <w:rPr>
-          <w:rFonts w:ascii="Times New Roman" w:eastAsia="Times New Roman" w:hAnsi="Times New Roman" w:cs="Times New Roman"/>
-          <w:kern w:val="0"/>
-          <w14:ligatures w14:val="none"/>
-        </w:rPr>
-        <w:t>HP every 3 time-step (mimic slow death)</w:t>
-      </w:r>
-    </w:p>
-    <w:p>
-      <w:pPr>
-        <w:pStyle w:val="ListParagraph"/>
-        <w:numPr>
-          <w:ilvl w:val="1"/>
-          <w:numId w:val="2"/>
-        </w:numPr>
-        <w:spacing w:before="100" w:beforeAutospacing="1" w:after="100" w:afterAutospacing="1" w:line="240" w:lineRule="auto"/>
-        <w:rPr>
-          <w:rFonts w:ascii="Times New Roman" w:eastAsia="Times New Roman" w:hAnsi="Times New Roman" w:cs="Times New Roman"/>
-          <w:kern w:val="0"/>
-          <w14:ligatures w14:val="none"/>
-        </w:rPr>
-      </w:pPr>
-      <w:r>
-        <w:rPr>
-          <w:rFonts w:ascii="Times New Roman" w:eastAsia="Times New Roman" w:hAnsi="Times New Roman" w:cs="Times New Roman"/>
-          <w:kern w:val="0"/>
-          <w14:ligatures w14:val="none"/>
-        </w:rPr>
-        <w:t>Reduce 25% velocity</w:t>
-      </w:r>
-    </w:p>
-    <w:p>
-      <w:pPr>
-        <w:pStyle w:val="ListParagraph"/>
-        <w:numPr>
-          <w:ilvl w:val="0"/>
-          <w:numId w:val="2"/>
-        </w:numPr>
-        <w:rPr>
-          <w:rFonts w:ascii="Times New Roman" w:eastAsia="Times New Roman" w:hAnsi="Times New Roman" w:cs="Times New Roman"/>
-          <w:kern w:val="0"/>
-          <w14:ligatures w14:val="none"/>
-        </w:rPr>
-      </w:pPr>
-      <w:r>
-        <w:rPr>
-          <w:rFonts w:ascii="Times New Roman" w:eastAsia="Times New Roman" w:hAnsi="Times New Roman" w:cs="Times New Roman"/>
-          <w:kern w:val="0"/>
-          <w14:ligatures w14:val="none"/>
-        </w:rPr>
-        <w:t xml:space="preserve">isRunning: True if a fish feel threatens by another fish. While in this </w:t>
-      </w:r>
-      <w:r>
-        <w:rPr>
-          <w:rFonts w:ascii="Times New Roman" w:eastAsia="Times New Roman" w:hAnsi="Times New Roman" w:cs="Times New Roman"/>
-          <w:kern w:val="0"/>
-          <w14:ligatures w14:val="none"/>
-        </w:rPr>
-        <w:t>state</w:t>
-      </w:r>
-      <w:r>
-        <w:rPr>
-          <w:rFonts w:ascii="Times New Roman" w:eastAsia="Times New Roman" w:hAnsi="Times New Roman" w:cs="Times New Roman"/>
-          <w:kern w:val="0"/>
-          <w14:ligatures w14:val="none"/>
-        </w:rPr>
-        <w:t>, a fish has a high chance to overwrite the the PSO Swarm’s action with running action away from the dangerous nearby valid targets (the one with MouthSize larger than the running’s BodySize).</w:t>
-      </w:r>
-      <w:r>
-        <w:rPr>
-          <w:rFonts w:ascii="Times New Roman" w:eastAsia="Times New Roman" w:hAnsi="Times New Roman" w:cs="Times New Roman"/>
-          <w:kern w:val="0"/>
-          <w14:ligatures w14:val="none"/>
-        </w:rPr>
-        <w:t xml:space="preserve"> Increase 50% </w:t>
-      </w:r>
-      <w:r>
-        <w:rPr>
-          <w:rFonts w:ascii="Times New Roman" w:eastAsia="Times New Roman" w:hAnsi="Times New Roman" w:cs="Times New Roman"/>
-          <w:kern w:val="0"/>
-          <w14:ligatures w14:val="none"/>
-        </w:rPr>
-        <w:t>velocity but cost 50</w:t>
-      </w:r>
-      <w:r>
-        <w:rPr>
-          <w:rFonts w:ascii="Times New Roman" w:eastAsia="Times New Roman" w:hAnsi="Times New Roman" w:cs="Times New Roman"/>
-          <w:kern w:val="0"/>
-          <w14:ligatures w14:val="none"/>
-        </w:rPr>
-        <w:t>%</w:t>
-      </w:r>
-      <w:r>
-        <w:rPr>
-          <w:rFonts w:ascii="Times New Roman" w:eastAsia="Times New Roman" w:hAnsi="Times New Roman" w:cs="Times New Roman"/>
-          <w:kern w:val="0"/>
-          <w14:ligatures w14:val="none"/>
-        </w:rPr>
-        <w:t xml:space="preserve"> more energy</w:t>
-      </w:r>
-      <w:r>
-        <w:rPr>
-          <w:rFonts w:ascii="Times New Roman" w:eastAsia="Times New Roman" w:hAnsi="Times New Roman" w:cs="Times New Roman"/>
-          <w:kern w:val="0"/>
-          <w14:ligatures w14:val="none"/>
-        </w:rPr>
-        <w:t xml:space="preserve"> per time-step</w:t>
-      </w:r>
-      <w:r>
-        <w:rPr>
-          <w:rFonts w:ascii="Times New Roman" w:eastAsia="Times New Roman" w:hAnsi="Times New Roman" w:cs="Times New Roman"/>
-          <w:kern w:val="0"/>
-          <w14:ligatures w14:val="none"/>
-        </w:rPr>
-        <w:t>, buff ends if running out of energy.</w:t>
-      </w:r>
-    </w:p>
-    <w:p>
-      <w:pPr>
-        <w:pStyle w:val="ListParagraph"/>
-        <w:numPr>
-          <w:ilvl w:val="0"/>
-          <w:numId w:val="2"/>
-        </w:numPr>
-        <w:spacing w:before="100" w:beforeAutospacing="1" w:after="100" w:afterAutospacing="1" w:line="240" w:lineRule="auto"/>
-        <w:rPr>
-          <w:rFonts w:ascii="Times New Roman" w:eastAsia="Times New Roman" w:hAnsi="Times New Roman" w:cs="Times New Roman"/>
-          <w:kern w:val="0"/>
-          <w14:ligatures w14:val="none"/>
-        </w:rPr>
-      </w:pPr>
-      <w:r>
-        <w:rPr>
-          <w:rFonts w:ascii="Times New Roman" w:eastAsia="Times New Roman" w:hAnsi="Times New Roman" w:cs="Times New Roman"/>
-          <w:kern w:val="0"/>
-          <w14:ligatures w14:val="none"/>
-        </w:rPr>
-        <w:t>isHunting</w:t>
-      </w:r>
-      <w:r>
-        <w:rPr>
-          <w:rFonts w:ascii="Times New Roman" w:eastAsia="Times New Roman" w:hAnsi="Times New Roman" w:cs="Times New Roman"/>
-          <w:kern w:val="0"/>
-          <w14:ligatures w14:val="none"/>
-        </w:rPr>
-        <w:t xml:space="preserve">: True if a fish trigger cannibal mode. While in this </w:t>
-      </w:r>
-      <w:r>
-        <w:rPr>
-          <w:rFonts w:ascii="Times New Roman" w:eastAsia="Times New Roman" w:hAnsi="Times New Roman" w:cs="Times New Roman"/>
-          <w:kern w:val="0"/>
-          <w14:ligatures w14:val="none"/>
-        </w:rPr>
-        <w:t>state</w:t>
-      </w:r>
-      <w:r>
-        <w:rPr>
-          <w:rFonts w:ascii="Times New Roman" w:eastAsia="Times New Roman" w:hAnsi="Times New Roman" w:cs="Times New Roman"/>
-          <w:kern w:val="0"/>
-          <w14:ligatures w14:val="none"/>
-        </w:rPr>
-        <w:t>, a fish has a high chance to overwrite the the PSO Swarm’s action with hunting action on nearby valid targets (the one with BodySize smaller than the hunting’s BodySize).</w:t>
-      </w:r>
-      <w:r>
-        <w:rPr>
-          <w:rFonts w:ascii="Times New Roman" w:eastAsia="Times New Roman" w:hAnsi="Times New Roman" w:cs="Times New Roman"/>
-          <w:kern w:val="0"/>
-          <w14:ligatures w14:val="none"/>
-        </w:rPr>
-        <w:t xml:space="preserve"> </w:t>
-      </w:r>
-      <w:r>
-        <w:rPr>
-          <w:rFonts w:ascii="Times New Roman" w:eastAsia="Times New Roman" w:hAnsi="Times New Roman" w:cs="Times New Roman"/>
-          <w:kern w:val="0"/>
-          <w14:ligatures w14:val="none"/>
-        </w:rPr>
-        <w:t xml:space="preserve">Increase 50% </w:t>
-      </w:r>
-      <w:r>
-        <w:rPr>
-          <w:rFonts w:ascii="Times New Roman" w:eastAsia="Times New Roman" w:hAnsi="Times New Roman" w:cs="Times New Roman"/>
-          <w:kern w:val="0"/>
-          <w14:ligatures w14:val="none"/>
-        </w:rPr>
-        <w:t>velocity but cost 50% more energy per time-step, buff ends if running out of energy.</w:t>
-      </w:r>
-    </w:p>
-    <w:p>
-      <w:pPr>
-        <w:spacing w:before="100" w:beforeAutospacing="1" w:after="100" w:afterAutospacing="1" w:line="240" w:lineRule="auto"/>
+      </w:pPr>
+      <w:r>
         <w:rPr>
           <w:rFonts w:ascii="Times New Roman" w:eastAsia="Times New Roman" w:hAnsi="Times New Roman" w:cs="Times New Roman"/>
           <w:b/>
@@ -5124,7 +5508,8 @@
           <w:kern w:val="0"/>
           <w14:ligatures w14:val="none"/>
         </w:rPr>
-      </w:pPr>
+        <w:t>How Cannibal Happens</w:t>
+      </w:r>
       <w:r>
         <w:rPr>
           <w:rFonts w:ascii="Times New Roman" w:eastAsia="Times New Roman" w:hAnsi="Times New Roman" w:cs="Times New Roman"/>
@@ -5136,8 +5521,34 @@
           <w:kern w:val="0"/>
           <w14:ligatures w14:val="none"/>
         </w:rPr>
-        <w:t>How Cannibal Happens</w:t>
-      </w:r>
+        <w:t xml:space="preserve">: </w:t>
+      </w:r>
+      <w:r>
+        <w:rPr>
+          <w:rFonts w:ascii="Times New Roman" w:eastAsia="Times New Roman" w:hAnsi="Times New Roman" w:cs="Times New Roman"/>
+          <w:kern w:val="0"/>
+          <w14:ligatures w14:val="none"/>
+        </w:rPr>
+        <w:t>If a cannibal's center coordinate enters the BodySize radius of a smaller fish, the physical collision occurs: the smaller fish's HP drops to 0 (removed from swarm), and the cannibal's Fullness increases.</w:t>
+      </w:r>
+      <w:r>
+        <w:rPr>
+          <w:rFonts w:ascii="Times New Roman" w:eastAsia="Times New Roman" w:hAnsi="Times New Roman" w:cs="Times New Roman"/>
+          <w:kern w:val="0"/>
+          <w14:ligatures w14:val="none"/>
+        </w:rPr>
+        <w:t xml:space="preserve"> The eaten fish is removed from the swarm, do not spam a dead body in this case.</w:t>
+      </w:r>
+    </w:p>
+    <w:p>
+      <w:pPr>
+        <w:spacing w:before="100" w:beforeAutospacing="1" w:after="100" w:afterAutospacing="1" w:line="240" w:lineRule="auto"/>
+        <w:rPr>
+          <w:rFonts w:ascii="Times New Roman" w:eastAsia="Times New Roman" w:hAnsi="Times New Roman" w:cs="Times New Roman"/>
+          <w:kern w:val="0"/>
+          <w14:ligatures w14:val="none"/>
+        </w:rPr>
+      </w:pPr>
       <w:r>
         <w:rPr>
           <w:rFonts w:ascii="Times New Roman" w:eastAsia="Times New Roman" w:hAnsi="Times New Roman" w:cs="Times New Roman"/>
@@ -5149,46 +5560,6 @@
           <w:kern w:val="0"/>
           <w14:ligatures w14:val="none"/>
         </w:rPr>
-        <w:t xml:space="preserve">: </w:t>
-      </w:r>
-      <w:r>
-        <w:rPr>
-          <w:rFonts w:ascii="Times New Roman" w:eastAsia="Times New Roman" w:hAnsi="Times New Roman" w:cs="Times New Roman"/>
-          <w:kern w:val="0"/>
-          <w14:ligatures w14:val="none"/>
-        </w:rPr>
-        <w:t>If a cannibal's center coordinate enters the BodySize radius of a smaller fish, the physical collision occurs: the smaller fish's HP drops to 0 (removed from swarm), and the cannibal's Fullness increases.</w:t>
-      </w:r>
-      <w:r>
-        <w:rPr>
-          <w:rFonts w:ascii="Times New Roman" w:eastAsia="Times New Roman" w:hAnsi="Times New Roman" w:cs="Times New Roman"/>
-          <w:kern w:val="0"/>
-          <w14:ligatures w14:val="none"/>
-        </w:rPr>
-        <w:t xml:space="preserve"> The eaten fish is removed from the swarm, do not spam a dead body in this case.</w:t>
-      </w:r>
-    </w:p>
-    <w:p>
-      <w:pPr>
-        <w:spacing w:before="100" w:beforeAutospacing="1" w:after="100" w:afterAutospacing="1" w:line="240" w:lineRule="auto"/>
-        <w:rPr>
-          <w:rFonts w:ascii="Times New Roman" w:eastAsia="Times New Roman" w:hAnsi="Times New Roman" w:cs="Times New Roman"/>
-          <w:kern w:val="0"/>
-          <w14:ligatures w14:val="none"/>
-        </w:rPr>
-      </w:pPr>
-      <w:r>
-        <w:rPr>
-          <w:rFonts w:ascii="Times New Roman" w:eastAsia="Times New Roman" w:hAnsi="Times New Roman" w:cs="Times New Roman"/>
-          <w:b/>
-          <w:bCs/>
-          <w:i/>
-          <w:iCs/>
-          <w:color w:val="00B0F0"/>
-          <w:kern w:val="0"/>
-          <w14:ligatures w14:val="none"/>
-        </w:rPr>
-        <w:lastRenderedPageBreak/>
         <w:t>Swarm Traits:</w:t>
       </w:r>
       <w:r>
@@ -5354,6 +5725,7 @@
           <w:kern w:val="0"/>
           <w14:ligatures w14:val="none"/>
         </w:rPr>
+        <w:lastRenderedPageBreak/>
         <w:t>Social Distance (The Cohesion Radius):</w:t>
       </w:r>
       <w:r>
@@ -5414,7 +5786,7 @@
           <w:kern w:val="0"/>
           <w14:ligatures w14:val="none"/>
         </w:rPr>
-        <w:t>This is a crucial addition to your model! If fish get too close to each other, they need a small repulsion vector to avoid clipping into one another. In your simulation, if this distance is too small, the swarm packs too tightly, which will trigger the Columnaris disease area due to overcrowding.</w:t>
+        <w:t>If fish get too close to each other, they need a small repulsion vector to avoid clipping into one another.</w:t>
       </w:r>
     </w:p>
     <w:p>
@@ -5503,23 +5875,23 @@
           <w:kern w:val="0"/>
           <w14:ligatures w14:val="none"/>
         </w:rPr>
-        <w:t>This vector dynamically scales with the Fullness stat. It is heavily prioritized when Fullness and Energy are low. When Fullness reaches maximum capacity, this vector drops to 0, and the fish stops eating.</w:t>
-      </w:r>
-      <w:r>
-        <w:rPr>
-          <w:rFonts w:ascii="Times New Roman" w:eastAsia="Times New Roman" w:hAnsi="Times New Roman" w:cs="Times New Roman"/>
-          <w:kern w:val="0"/>
-          <w14:ligatures w14:val="none"/>
-        </w:rPr>
-        <w:t xml:space="preserve"> </w:t>
-      </w:r>
-      <w:r>
-        <w:rPr>
-          <w:rFonts w:ascii="Times New Roman" w:eastAsia="Times New Roman" w:hAnsi="Times New Roman" w:cs="Times New Roman"/>
-          <w:kern w:val="0"/>
-          <w14:ligatures w14:val="none"/>
-        </w:rPr>
-        <w:t>The weight of this vector dynamically scales inversely with the distance to the pellet.</w:t>
+        <w:t xml:space="preserve">This vector dynamically scales with the Fullness stat. It is heavily prioritized when Fullness and Energy are low. When Fullness </w:t>
+      </w:r>
+      <w:r>
+        <w:rPr>
+          <w:rFonts w:ascii="Times New Roman" w:eastAsia="Times New Roman" w:hAnsi="Times New Roman" w:cs="Times New Roman"/>
+          <w:kern w:val="0"/>
+          <w14:ligatures w14:val="none"/>
+        </w:rPr>
+        <w:t>is</w:t>
+      </w:r>
+      <w:r>
+        <w:rPr>
+          <w:rFonts w:ascii="Times New Roman" w:eastAsia="Times New Roman" w:hAnsi="Times New Roman" w:cs="Times New Roman"/>
+          <w:kern w:val="0"/>
+          <w14:ligatures w14:val="none"/>
+        </w:rPr>
+        <w:t xml:space="preserve"> maximum, this vector drops to 0, and the fish stops eating.</w:t>
       </w:r>
     </w:p>
     <w:p>
@@ -5771,7 +6143,23 @@
           <w:kern w:val="0"/>
           <w14:ligatures w14:val="none"/>
         </w:rPr>
-        <w:t>The critical survival drive to navigate toward and absorb moving Oxygen bubbles.</w:t>
+        <w:t xml:space="preserve">The critical survival drive to navigate toward and absorb moving Oxygen </w:t>
+      </w:r>
+      <w:r>
+        <w:rPr>
+          <w:rFonts w:ascii="Times New Roman" w:eastAsia="Times New Roman" w:hAnsi="Times New Roman" w:cs="Times New Roman"/>
+          <w:kern w:val="0"/>
+          <w14:ligatures w14:val="none"/>
+        </w:rPr>
+        <w:t>B</w:t>
+      </w:r>
+      <w:r>
+        <w:rPr>
+          <w:rFonts w:ascii="Times New Roman" w:eastAsia="Times New Roman" w:hAnsi="Times New Roman" w:cs="Times New Roman"/>
+          <w:kern w:val="0"/>
+          <w14:ligatures w14:val="none"/>
+        </w:rPr>
+        <w:t>ubbles.</w:t>
       </w:r>
       <w:r>
         <w:rPr>
@@ -5803,7 +6191,23 @@
           <w:kern w:val="0"/>
           <w14:ligatures w14:val="none"/>
         </w:rPr>
-        <w:t>is vector must violently override all other foraging vectors (cFood and cProbiotic) when the oxygen stat falls below a critical threshold.</w:t>
+        <w:t xml:space="preserve">is vector </w:t>
+      </w:r>
+      <w:r>
+        <w:rPr>
+          <w:rFonts w:ascii="Times New Roman" w:eastAsia="Times New Roman" w:hAnsi="Times New Roman" w:cs="Times New Roman"/>
+          <w:kern w:val="0"/>
+          <w14:ligatures w14:val="none"/>
+        </w:rPr>
+        <w:t>has higher prioritity over</w:t>
+      </w:r>
+      <w:r>
+        <w:rPr>
+          <w:rFonts w:ascii="Times New Roman" w:eastAsia="Times New Roman" w:hAnsi="Times New Roman" w:cs="Times New Roman"/>
+          <w:kern w:val="0"/>
+          <w14:ligatures w14:val="none"/>
+        </w:rPr>
+        <w:t xml:space="preserve"> other foraging vectors (cFood and cProbiotic) when the oxygen stat falls below a critical threshold.</w:t>
       </w:r>
       <w:r>
         <w:rPr>
@@ -6031,7 +6435,15 @@
           <w:kern w:val="0"/>
           <w14:ligatures w14:val="none"/>
         </w:rPr>
-        <w:t xml:space="preserve">. </w:t>
+        <w:t xml:space="preserve"> because</w:t>
+      </w:r>
+      <w:r>
+        <w:rPr>
+          <w:rFonts w:ascii="Times New Roman" w:eastAsia="Times New Roman" w:hAnsi="Times New Roman" w:cs="Times New Roman"/>
+          <w:kern w:val="0"/>
+          <w14:ligatures w14:val="none"/>
+        </w:rPr>
+        <w:t xml:space="preserve"> </w:t>
       </w:r>
       <w:r>
         <w:rPr>
@@ -6056,32 +6468,47 @@
           <w:kern w:val="0"/>
           <w14:ligatures w14:val="none"/>
         </w:rPr>
-        <w:t xml:space="preserve"> actively drains the Oxygen stat faster. If Oxygen hits 0, the fish instantly dies.</w:t>
-      </w:r>
-      <w:r>
-        <w:rPr>
-          <w:rFonts w:ascii="Times New Roman" w:eastAsia="Times New Roman" w:hAnsi="Times New Roman" w:cs="Times New Roman"/>
-          <w:kern w:val="0"/>
-          <w14:ligatures w14:val="none"/>
-        </w:rPr>
-        <w:t xml:space="preserve"> The</w:t>
-      </w:r>
-      <w:r>
-        <w:rPr>
-          <w:rFonts w:ascii="Times New Roman" w:eastAsia="Times New Roman" w:hAnsi="Times New Roman" w:cs="Times New Roman"/>
-          <w:kern w:val="0"/>
-          <w14:ligatures w14:val="none"/>
-        </w:rPr>
-        <w:t xml:space="preserve"> EA should evolve this to be a massive </w:t>
-      </w:r>
-      <w:r>
-        <w:rPr>
-          <w:rFonts w:ascii="Times New Roman" w:eastAsia="Times New Roman" w:hAnsi="Times New Roman" w:cs="Times New Roman"/>
-          <w:kern w:val="0"/>
-          <w14:ligatures w14:val="none"/>
-        </w:rPr>
-        <w:lastRenderedPageBreak/>
-        <w:t xml:space="preserve">repulsive weight. A fish should </w:t>
+        <w:t xml:space="preserve"> </w:t>
+      </w:r>
+      <w:r>
+        <w:rPr>
+          <w:rFonts w:ascii="Times New Roman" w:eastAsia="Times New Roman" w:hAnsi="Times New Roman" w:cs="Times New Roman"/>
+          <w:kern w:val="0"/>
+          <w14:ligatures w14:val="none"/>
+        </w:rPr>
+        <w:t>quickly</w:t>
+      </w:r>
+      <w:r>
+        <w:rPr>
+          <w:rFonts w:ascii="Times New Roman" w:eastAsia="Times New Roman" w:hAnsi="Times New Roman" w:cs="Times New Roman"/>
+          <w:kern w:val="0"/>
+          <w14:ligatures w14:val="none"/>
+        </w:rPr>
+        <w:t xml:space="preserve"> drains the Oxygen. </w:t>
+      </w:r>
+      <w:r>
+        <w:rPr>
+          <w:rFonts w:ascii="Times New Roman" w:eastAsia="Times New Roman" w:hAnsi="Times New Roman" w:cs="Times New Roman"/>
+          <w:kern w:val="0"/>
+          <w14:ligatures w14:val="none"/>
+        </w:rPr>
+        <w:t xml:space="preserve">A </w:t>
+      </w:r>
+      <w:r>
+        <w:rPr>
+          <w:rFonts w:ascii="Times New Roman" w:eastAsia="Times New Roman" w:hAnsi="Times New Roman" w:cs="Times New Roman"/>
+          <w:kern w:val="0"/>
+          <w14:ligatures w14:val="none"/>
+        </w:rPr>
+        <w:t>swarm</w:t>
+      </w:r>
+      <w:r>
+        <w:rPr>
+          <w:rFonts w:ascii="Times New Roman" w:eastAsia="Times New Roman" w:hAnsi="Times New Roman" w:cs="Times New Roman"/>
+          <w:kern w:val="0"/>
+          <w14:ligatures w14:val="none"/>
+        </w:rPr>
+        <w:t xml:space="preserve"> should </w:t>
       </w:r>
       <w:r>
         <w:rPr>
@@ -6105,7 +6532,23 @@
           <w:kern w:val="0"/>
           <w14:ligatures w14:val="none"/>
         </w:rPr>
-        <w:t xml:space="preserve">, unless it is hungry and there is </w:t>
+        <w:t xml:space="preserve">, unless </w:t>
+      </w:r>
+      <w:r>
+        <w:rPr>
+          <w:rFonts w:ascii="Times New Roman" w:eastAsia="Times New Roman" w:hAnsi="Times New Roman" w:cs="Times New Roman"/>
+          <w:kern w:val="0"/>
+          <w14:ligatures w14:val="none"/>
+        </w:rPr>
+        <w:t>they are extremely</w:t>
+      </w:r>
+      <w:r>
+        <w:rPr>
+          <w:rFonts w:ascii="Times New Roman" w:eastAsia="Times New Roman" w:hAnsi="Times New Roman" w:cs="Times New Roman"/>
+          <w:kern w:val="0"/>
+          <w14:ligatures w14:val="none"/>
+        </w:rPr>
+        <w:t xml:space="preserve"> hungry and there is </w:t>
       </w:r>
       <w:r>
         <w:rPr>
@@ -6201,23 +6644,23 @@
           <w:kern w:val="0"/>
           <w14:ligatures w14:val="none"/>
         </w:rPr>
-        <w:t>Being in this area drains Immunity by 1 each timestep. If Immunity &lt;= 0, the fish becomes infected and starts losing HP.</w:t>
-      </w:r>
-      <w:r>
-        <w:rPr>
-          <w:rFonts w:ascii="Times New Roman" w:eastAsia="Times New Roman" w:hAnsi="Times New Roman" w:cs="Times New Roman"/>
-          <w:kern w:val="0"/>
-          <w14:ligatures w14:val="none"/>
-        </w:rPr>
-        <w:t xml:space="preserve"> </w:t>
-      </w:r>
-      <w:r>
-        <w:rPr>
-          <w:rFonts w:ascii="Times New Roman" w:eastAsia="Times New Roman" w:hAnsi="Times New Roman" w:cs="Times New Roman"/>
-          <w:kern w:val="0"/>
-          <w14:ligatures w14:val="none"/>
-        </w:rPr>
-        <w:t>The fish might risk grazing the edge of this zone if it has the isBoosting state from a probiotic but otherwise should route around it.</w:t>
+        <w:t xml:space="preserve">The </w:t>
+      </w:r>
+      <w:r>
+        <w:rPr>
+          <w:rFonts w:ascii="Times New Roman" w:eastAsia="Times New Roman" w:hAnsi="Times New Roman" w:cs="Times New Roman"/>
+          <w:kern w:val="0"/>
+          <w14:ligatures w14:val="none"/>
+        </w:rPr>
+        <w:t>swarm</w:t>
+      </w:r>
+      <w:r>
+        <w:rPr>
+          <w:rFonts w:ascii="Times New Roman" w:eastAsia="Times New Roman" w:hAnsi="Times New Roman" w:cs="Times New Roman"/>
+          <w:kern w:val="0"/>
+          <w14:ligatures w14:val="none"/>
+        </w:rPr>
+        <w:t xml:space="preserve"> might risk grazing the edge of this zone if it has the isBoosting state from a probiotic but otherwise should route around it.</w:t>
       </w:r>
     </w:p>
     <w:p>
@@ -6268,15 +6711,15 @@
           <w:kern w:val="0"/>
           <w14:ligatures w14:val="none"/>
         </w:rPr>
-        <w:t xml:space="preserve"> T</w:t>
-      </w:r>
-      <w:r>
-        <w:rPr>
-          <w:rFonts w:ascii="Times New Roman" w:eastAsia="Times New Roman" w:hAnsi="Times New Roman" w:cs="Times New Roman"/>
-          <w:kern w:val="0"/>
-          <w14:ligatures w14:val="none"/>
-        </w:rPr>
-        <w:t>his avoidance vector must be heavily weighted by the EA. A swarm that does not fear this vector will rapidly burn out its energy reserves and die.</w:t>
+        <w:t xml:space="preserve"> </w:t>
+      </w:r>
+      <w:r>
+        <w:rPr>
+          <w:rFonts w:ascii="Times New Roman" w:eastAsia="Times New Roman" w:hAnsi="Times New Roman" w:cs="Times New Roman"/>
+          <w:kern w:val="0"/>
+          <w14:ligatures w14:val="none"/>
+        </w:rPr>
+        <w:t>A swarm that does not fear this vector will rapidly burn out its energy reserves and die.</w:t>
       </w:r>
     </w:p>
     <w:p>
@@ -6341,7 +6784,23 @@
           <w:kern w:val="0"/>
           <w14:ligatures w14:val="none"/>
         </w:rPr>
-        <w:t>If hasParasite == True, this vector</w:t>
+        <w:t xml:space="preserve">If </w:t>
+      </w:r>
+      <w:r>
+        <w:rPr>
+          <w:rFonts w:ascii="Times New Roman" w:eastAsia="Times New Roman" w:hAnsi="Times New Roman" w:cs="Times New Roman"/>
+          <w:kern w:val="0"/>
+          <w14:ligatures w14:val="none"/>
+        </w:rPr>
+        <w:t xml:space="preserve">many individual </w:t>
+      </w:r>
+      <w:r>
+        <w:rPr>
+          <w:rFonts w:ascii="Times New Roman" w:eastAsia="Times New Roman" w:hAnsi="Times New Roman" w:cs="Times New Roman"/>
+          <w:kern w:val="0"/>
+          <w14:ligatures w14:val="none"/>
+        </w:rPr>
+        <w:t>hasParasite == True, this vector</w:t>
       </w:r>
       <w:r>
         <w:rPr>
@@ -6365,7 +6824,7 @@
           <w:kern w:val="0"/>
           <w14:ligatures w14:val="none"/>
         </w:rPr>
-        <w:t>increases by PSO</w:t>
+        <w:t>increases</w:t>
       </w:r>
       <w:r>
         <w:rPr>
@@ -6397,7 +6856,39 @@
           <w:kern w:val="0"/>
           <w14:ligatures w14:val="none"/>
         </w:rPr>
-        <w:t xml:space="preserve"> while suffering from the hunger, being slow, and painful HP drains, creating a struggling realistic interaction.</w:t>
+        <w:t xml:space="preserve"> while suffering from the hunger, being slow, and painful HP drains, creating a </w:t>
+      </w:r>
+      <w:r>
+        <w:rPr>
+          <w:rFonts w:ascii="Times New Roman" w:eastAsia="Times New Roman" w:hAnsi="Times New Roman" w:cs="Times New Roman"/>
+          <w:kern w:val="0"/>
+          <w14:ligatures w14:val="none"/>
+        </w:rPr>
+        <w:t xml:space="preserve">realistic </w:t>
+      </w:r>
+      <w:r>
+        <w:rPr>
+          <w:rFonts w:ascii="Times New Roman" w:eastAsia="Times New Roman" w:hAnsi="Times New Roman" w:cs="Times New Roman"/>
+          <w:kern w:val="0"/>
+          <w14:ligatures w14:val="none"/>
+        </w:rPr>
+        <w:t>struggling</w:t>
+      </w:r>
+      <w:r>
+        <w:rPr>
+          <w:rFonts w:ascii="Times New Roman" w:eastAsia="Times New Roman" w:hAnsi="Times New Roman" w:cs="Times New Roman"/>
+          <w:kern w:val="0"/>
+          <w14:ligatures w14:val="none"/>
+        </w:rPr>
+        <w:t xml:space="preserve"> and indecisive</w:t>
+      </w:r>
+      <w:r>
+        <w:rPr>
+          <w:rFonts w:ascii="Times New Roman" w:eastAsia="Times New Roman" w:hAnsi="Times New Roman" w:cs="Times New Roman"/>
+          <w:kern w:val="0"/>
+          <w14:ligatures w14:val="none"/>
+        </w:rPr>
+        <w:t xml:space="preserve"> interaction.</w:t>
       </w:r>
     </w:p>
     <w:p>
@@ -6456,7 +6947,16 @@
           <w:kern w:val="0"/>
           <w14:ligatures w14:val="none"/>
         </w:rPr>
-        <w:t>The PSO constantly checks the MouthSize and BodySize traits of neighboring fish. If a neighbor’s MouthSize is strictly larger than the subject's BodySize, a massive negative weight is applied, forcing the smaller fish to flee.</w:t>
+        <w:t xml:space="preserve">The PSO constantly checks the MouthSize and BodySize traits of neighboring fish. If a neighbor’s </w:t>
+      </w:r>
+      <w:r>
+        <w:rPr>
+          <w:rFonts w:ascii="Times New Roman" w:eastAsia="Times New Roman" w:hAnsi="Times New Roman" w:cs="Times New Roman"/>
+          <w:kern w:val="0"/>
+          <w14:ligatures w14:val="none"/>
+        </w:rPr>
+        <w:lastRenderedPageBreak/>
+        <w:t>MouthSize is strictly larger than the subject's BodySize, a massive negative weight is applied, forcing the smaller fish to flee.</w:t>
       </w:r>
     </w:p>
     <w:p>

</xml_diff>